<commit_message>
docs: add roadmap and 5-member assignment, align guide with it
Co-Authored-By: Claude Opus 5.5 (1M context) <noreply@anthropic.com>
Claude-Session: https://claude.ai/code/session_01P6diorHNxoZm6F9hqvGUzz
</commit_message>
<xml_diff>
--- a/docs/files/Huong_dan_Thanh_vien_1_De_tai_10_Dataset_v1.docx
+++ b/docs/files/Huong_dan_Thanh_vien_1_De_tai_10_Dataset_v1.docx
@@ -77,7 +77,7 @@
           <w:sz w:val="20"/>
           <w:szCs w:val="20"/>
         </w:rPr>
-        <w:t xml:space="preserve"> Thành viên 1 phụ trách thu thập tài liệu, tiền xử lý, chia đoạn, bộ câu hỏi có nhãn và baseline TF IDF, BM25</w:t>
+        <w:t xml:space="preserve"> Thành viên 1 phụ trách thu thập tài liệu, tiền xử lý, chia đoạn, freeze Dataset v1 và baseline TF IDF, BM25. Bộ câu hỏi do cả nhóm viết, Thành viên 2 điều phối (xem file Lộ trình và phân công)</w:t>
       </w:r>
     </w:p>
     <w:p>
@@ -635,7 +635,7 @@
                 <w:sz w:val="18"/>
                 <w:szCs w:val="18"/>
               </w:rPr>
-              <w:t xml:space="preserve">documents.csv, báo cáo chất lượng</w:t>
+              <w:t xml:space="preserve">docs.jsonl, báo cáo chất lượng</w:t>
             </w:r>
           </w:p>
         </w:tc>
@@ -730,7 +730,7 @@
                 <w:sz w:val="18"/>
                 <w:szCs w:val="18"/>
               </w:rPr>
-              <w:t xml:space="preserve">chunks.csv có chunk_id ổn định</w:t>
+              <w:t xml:space="preserve">chunks.jsonl có chunk_id ổn định</w:t>
             </w:r>
           </w:p>
         </w:tc>
@@ -794,7 +794,7 @@
                 <w:sz w:val="18"/>
                 <w:szCs w:val="18"/>
               </w:rPr>
-              <w:t xml:space="preserve">Xây bộ câu hỏi và gán nhãn đoạn đúng</w:t>
+              <w:t xml:space="preserve">Viết câu hỏi phần mình, gán nhãn chéo (TV2 điều phối)</w:t>
             </w:r>
           </w:p>
         </w:tc>
@@ -889,7 +889,7 @@
                 <w:sz w:val="18"/>
                 <w:szCs w:val="18"/>
               </w:rPr>
-              <w:t xml:space="preserve">Kiểm tra chất lượng nhãn</w:t>
+              <w:t xml:space="preserve">Kiểm tra chất lượng nhãn (TV2 chủ trì)</w:t>
             </w:r>
           </w:p>
         </w:tc>
@@ -920,7 +920,7 @@
                 <w:sz w:val="18"/>
                 <w:szCs w:val="18"/>
               </w:rPr>
-              <w:t xml:space="preserve">Tỷ lệ đồng thuận, danh sách sửa nhãn</w:t>
+              <w:t xml:space="preserve">Cohen kappa, danh sách sửa nhãn</w:t>
             </w:r>
           </w:p>
         </w:tc>
@@ -1299,7 +1299,7 @@
           <w:sz w:val="17"/>
           <w:szCs w:val="17"/>
         </w:rPr>
-        <w:t xml:space="preserve">  interim/documents.csv</w:t>
+        <w:t xml:space="preserve">  interim/docs.jsonl</w:t>
       </w:r>
     </w:p>
     <w:p>
@@ -1314,22 +1314,7 @@
           <w:sz w:val="17"/>
           <w:szCs w:val="17"/>
         </w:rPr>
-        <w:t xml:space="preserve">  processed/chunks.csv</w:t>
-      </w:r>
-    </w:p>
-    <w:p>
-      <w:pPr>
-        <w:shd w:fill="F3F6F8" w:color="auto" w:val="clear"/>
-        <w:spacing w:after="0" w:before="0"/>
-        <w:ind w:left="120" w:right="120"/>
-      </w:pPr>
-      <w:r>
-        <w:rPr>
-          <w:rFonts w:ascii="Consolas" w:cs="Consolas" w:eastAsia="Consolas" w:hAnsi="Consolas"/>
-          <w:sz w:val="17"/>
-          <w:szCs w:val="17"/>
-        </w:rPr>
-        <w:t xml:space="preserve">  processed/chunks_segmented.csv</w:t>
+        <w:t xml:space="preserve">  processed/chunks.jsonl</w:t>
       </w:r>
     </w:p>
     <w:p>
@@ -5076,7 +5061,7 @@
           <w:sz w:val="20"/>
           <w:szCs w:val="20"/>
         </w:rPr>
-        <w:t xml:space="preserve"> data/interim/documents.csv, results/data_quality/corpus_report.md, results/data_quality/near_duplicate_docs.csv.</w:t>
+        <w:t xml:space="preserve"> data/interim/docs.jsonl, results/data_quality/corpus_report.md, results/data_quality/near_duplicate_docs.csv.</w:t>
       </w:r>
     </w:p>
     <w:p>
@@ -5248,7 +5233,7 @@
                 <w:sz w:val="18"/>
                 <w:szCs w:val="18"/>
               </w:rPr>
-              <w:t xml:space="preserve">Cột chunks.csv</w:t>
+              <w:t xml:space="preserve">Trường trong chunks.jsonl</w:t>
             </w:r>
           </w:p>
         </w:tc>
@@ -5635,6 +5620,70 @@
                 <w:sz w:val="18"/>
                 <w:szCs w:val="18"/>
               </w:rPr>
+              <w:t xml:space="preserve">text_seg</w:t>
+            </w:r>
+          </w:p>
+        </w:tc>
+        <w:tc>
+          <w:tcPr>
+            <w:tcW w:type="dxa" w:w="6960"/>
+            <w:tcBorders>
+              <w:top w:val="single" w:color="BFC9D1" w:sz="4"/>
+              <w:left w:val="single" w:color="BFC9D1" w:sz="4"/>
+              <w:bottom w:val="single" w:color="BFC9D1" w:sz="4"/>
+              <w:right w:val="single" w:color="BFC9D1" w:sz="4"/>
+            </w:tcBorders>
+            <w:shd w:fill="EEF4F8" w:color="auto" w:val="clear"/>
+            <w:tcMar>
+              <w:top w:type="dxa" w:w="60"/>
+              <w:left w:type="dxa" w:w="100"/>
+              <w:bottom w:type="dxa" w:w="60"/>
+              <w:right w:type="dxa" w:w="100"/>
+            </w:tcMar>
+          </w:tcPr>
+          <w:p>
+            <w:pPr>
+              <w:jc w:val="left"/>
+            </w:pPr>
+            <w:r>
+              <w:rPr>
+                <w:rFonts w:ascii="Arial" w:cs="Arial" w:eastAsia="Arial" w:hAnsi="Arial"/>
+                <w:sz w:val="18"/>
+                <w:szCs w:val="18"/>
+              </w:rPr>
+              <w:t xml:space="preserve">chunk_text đã tách từ, dùng cho BM25 mức từ và PhoBERT</w:t>
+            </w:r>
+          </w:p>
+        </w:tc>
+      </w:tr>
+      <w:tr>
+        <w:tc>
+          <w:tcPr>
+            <w:tcW w:type="dxa" w:w="2400"/>
+            <w:tcBorders>
+              <w:top w:val="single" w:color="BFC9D1" w:sz="4"/>
+              <w:left w:val="single" w:color="BFC9D1" w:sz="4"/>
+              <w:bottom w:val="single" w:color="BFC9D1" w:sz="4"/>
+              <w:right w:val="single" w:color="BFC9D1" w:sz="4"/>
+            </w:tcBorders>
+            <w:shd w:fill="FFFFFF" w:color="auto" w:val="clear"/>
+            <w:tcMar>
+              <w:top w:type="dxa" w:w="60"/>
+              <w:left w:type="dxa" w:w="100"/>
+              <w:bottom w:type="dxa" w:w="60"/>
+              <w:right w:type="dxa" w:w="100"/>
+            </w:tcMar>
+          </w:tcPr>
+          <w:p>
+            <w:pPr>
+              <w:jc w:val="left"/>
+            </w:pPr>
+            <w:r>
+              <w:rPr>
+                <w:rFonts w:ascii="Arial" w:cs="Arial" w:eastAsia="Arial" w:hAnsi="Arial"/>
+                <w:sz w:val="18"/>
+                <w:szCs w:val="18"/>
+              </w:rPr>
               <w:t xml:space="preserve">n_tokens</w:t>
             </w:r>
           </w:p>
@@ -5648,7 +5697,7 @@
               <w:bottom w:val="single" w:color="BFC9D1" w:sz="4"/>
               <w:right w:val="single" w:color="BFC9D1" w:sz="4"/>
             </w:tcBorders>
-            <w:shd w:fill="EEF4F8" w:color="auto" w:val="clear"/>
+            <w:shd w:fill="FFFFFF" w:color="auto" w:val="clear"/>
             <w:tcMar>
               <w:top w:type="dxa" w:w="60"/>
               <w:left w:type="dxa" w:w="100"/>
@@ -5703,7 +5752,7 @@
           <w:sz w:val="20"/>
           <w:szCs w:val="20"/>
         </w:rPr>
-        <w:t xml:space="preserve">chunks.csv giữ văn bản chưa tách từ, dùng cho Sentence-BERT đa ngôn ngữ và BM25 mức âm tiết.</w:t>
+        <w:t xml:space="preserve">Trường chunk_text giữ văn bản chưa tách từ, dùng cho Sentence-BERT đa ngôn ngữ và BM25 mức âm tiết.</w:t>
       </w:r>
     </w:p>
     <w:p>
@@ -5721,7 +5770,7 @@
           <w:sz w:val="20"/>
           <w:szCs w:val="20"/>
         </w:rPr>
-        <w:t xml:space="preserve">chunks_segmented.csv tách từ bằng một công cụ duy nhất đã chốt (underthesea, pyvi hoặc VnCoreNLP), ghi tên và phiên bản vào preprocessing.yaml. PhoBERT yêu cầu đầu vào đã tách từ.</w:t>
+        <w:t xml:space="preserve">Trường text_seg tách từ bằng một công cụ duy nhất đã chốt (underthesea, pyvi hoặc VnCoreNLP), ghi tên và phiên bản vào preprocessing.yaml. PhoBERT yêu cầu đầu vào đã tách từ.</w:t>
       </w:r>
     </w:p>
     <w:p>
@@ -5906,7 +5955,7 @@
                 <w:sz w:val="18"/>
                 <w:szCs w:val="18"/>
               </w:rPr>
-              <w:t xml:space="preserve">Duy nhất; cùng tập ID giữa chunks và chunks_segmented</w:t>
+              <w:t xml:space="preserve">Duy nhất; mọi chunk có cả chunk_text và text_seg</w:t>
             </w:r>
           </w:p>
         </w:tc>
@@ -6209,7 +6258,7 @@
           <w:sz w:val="20"/>
           <w:szCs w:val="20"/>
         </w:rPr>
-        <w:t xml:space="preserve">Mục tiêu khoảng 300 đến 500 câu hỏi, mỗi câu gán một hoặc vài chunk đúng. Thà ít thủ tục mà nhiều câu hỏi chất lượng, còn hơn nhiều thủ tục mà câu hỏi sơ sài.</w:t>
+        <w:t xml:space="preserve">Mục tiêu khoảng 300 câu hỏi (5 người, mỗi người khoảng 60 câu), mỗi câu gán một hoặc vài chunk đúng. Thà ít thủ tục mà nhiều câu hỏi chất lượng, còn hơn nhiều thủ tục mà câu hỏi sơ sài.</w:t>
       </w:r>
     </w:p>
     <w:p>
@@ -6614,7 +6663,7 @@
                 <w:sz w:val="18"/>
                 <w:szCs w:val="18"/>
               </w:rPr>
-              <w:t xml:space="preserve">25%</w:t>
+              <w:t xml:space="preserve">20%</w:t>
             </w:r>
           </w:p>
         </w:tc>
@@ -7244,7 +7293,133 @@
                 <w:sz w:val="18"/>
                 <w:szCs w:val="18"/>
               </w:rPr>
-              <w:t xml:space="preserve">15%</w:t>
+              <w:t xml:space="preserve">10%</w:t>
+            </w:r>
+          </w:p>
+        </w:tc>
+      </w:tr>
+      <w:tr>
+        <w:tc>
+          <w:tcPr>
+            <w:tcW w:type="dxa" w:w="1700"/>
+            <w:tcBorders>
+              <w:top w:val="single" w:color="BFC9D1" w:sz="4"/>
+              <w:left w:val="single" w:color="BFC9D1" w:sz="4"/>
+              <w:bottom w:val="single" w:color="BFC9D1" w:sz="4"/>
+              <w:right w:val="single" w:color="BFC9D1" w:sz="4"/>
+            </w:tcBorders>
+            <w:shd w:fill="FFFFFF" w:color="auto" w:val="clear"/>
+            <w:tcMar>
+              <w:top w:type="dxa" w:w="60"/>
+              <w:left w:type="dxa" w:w="100"/>
+              <w:bottom w:type="dxa" w:w="60"/>
+              <w:right w:type="dxa" w:w="100"/>
+            </w:tcMar>
+          </w:tcPr>
+          <w:p>
+            <w:pPr>
+              <w:jc w:val="left"/>
+            </w:pPr>
+            <w:r>
+              <w:rPr>
+                <w:rFonts w:ascii="Arial" w:cs="Arial" w:eastAsia="Arial" w:hAnsi="Arial"/>
+                <w:sz w:val="18"/>
+                <w:szCs w:val="18"/>
+              </w:rPr>
+              <w:t xml:space="preserve">unsupported</w:t>
+            </w:r>
+          </w:p>
+        </w:tc>
+        <w:tc>
+          <w:tcPr>
+            <w:tcW w:type="dxa" w:w="2400"/>
+            <w:tcBorders>
+              <w:top w:val="single" w:color="BFC9D1" w:sz="4"/>
+              <w:left w:val="single" w:color="BFC9D1" w:sz="4"/>
+              <w:bottom w:val="single" w:color="BFC9D1" w:sz="4"/>
+              <w:right w:val="single" w:color="BFC9D1" w:sz="4"/>
+            </w:tcBorders>
+            <w:shd w:fill="FFFFFF" w:color="auto" w:val="clear"/>
+            <w:tcMar>
+              <w:top w:type="dxa" w:w="60"/>
+              <w:left w:type="dxa" w:w="100"/>
+              <w:bottom w:type="dxa" w:w="60"/>
+              <w:right w:type="dxa" w:w="100"/>
+            </w:tcMar>
+          </w:tcPr>
+          <w:p>
+            <w:pPr>
+              <w:jc w:val="left"/>
+            </w:pPr>
+            <w:r>
+              <w:rPr>
+                <w:rFonts w:ascii="Arial" w:cs="Arial" w:eastAsia="Arial" w:hAnsi="Arial"/>
+                <w:sz w:val="18"/>
+                <w:szCs w:val="18"/>
+              </w:rPr>
+              <w:t xml:space="preserve">Trong phạm vi nhưng kho không có đáp án, dễ bịa</w:t>
+            </w:r>
+          </w:p>
+        </w:tc>
+        <w:tc>
+          <w:tcPr>
+            <w:tcW w:type="dxa" w:w="3860"/>
+            <w:tcBorders>
+              <w:top w:val="single" w:color="BFC9D1" w:sz="4"/>
+              <w:left w:val="single" w:color="BFC9D1" w:sz="4"/>
+              <w:bottom w:val="single" w:color="BFC9D1" w:sz="4"/>
+              <w:right w:val="single" w:color="BFC9D1" w:sz="4"/>
+            </w:tcBorders>
+            <w:shd w:fill="FFFFFF" w:color="auto" w:val="clear"/>
+            <w:tcMar>
+              <w:top w:type="dxa" w:w="60"/>
+              <w:left w:type="dxa" w:w="100"/>
+              <w:bottom w:type="dxa" w:w="60"/>
+              <w:right w:type="dxa" w:w="100"/>
+            </w:tcMar>
+          </w:tcPr>
+          <w:p>
+            <w:pPr>
+              <w:jc w:val="left"/>
+            </w:pPr>
+            <w:r>
+              <w:rPr>
+                <w:rFonts w:ascii="Arial" w:cs="Arial" w:eastAsia="Arial" w:hAnsi="Arial"/>
+                <w:sz w:val="18"/>
+                <w:szCs w:val="18"/>
+              </w:rPr>
+              <w:t xml:space="preserve">Đăng ký khai sinh trễ bị phạt bao nhiêu</w:t>
+            </w:r>
+          </w:p>
+        </w:tc>
+        <w:tc>
+          <w:tcPr>
+            <w:tcW w:type="dxa" w:w="1400"/>
+            <w:tcBorders>
+              <w:top w:val="single" w:color="BFC9D1" w:sz="4"/>
+              <w:left w:val="single" w:color="BFC9D1" w:sz="4"/>
+              <w:bottom w:val="single" w:color="BFC9D1" w:sz="4"/>
+              <w:right w:val="single" w:color="BFC9D1" w:sz="4"/>
+            </w:tcBorders>
+            <w:shd w:fill="FFFFFF" w:color="auto" w:val="clear"/>
+            <w:tcMar>
+              <w:top w:type="dxa" w:w="60"/>
+              <w:left w:type="dxa" w:w="100"/>
+              <w:bottom w:type="dxa" w:w="60"/>
+              <w:right w:type="dxa" w:w="100"/>
+            </w:tcMar>
+          </w:tcPr>
+          <w:p>
+            <w:pPr>
+              <w:jc w:val="left"/>
+            </w:pPr>
+            <w:r>
+              <w:rPr>
+                <w:rFonts w:ascii="Arial" w:cs="Arial" w:eastAsia="Arial" w:hAnsi="Arial"/>
+                <w:sz w:val="18"/>
+                <w:szCs w:val="18"/>
+              </w:rPr>
+              <w:t xml:space="preserve">10%</w:t>
             </w:r>
           </w:p>
         </w:tc>
@@ -7606,7 +7781,7 @@
                 <w:sz w:val="18"/>
                 <w:szCs w:val="18"/>
               </w:rPr>
-              <w:t xml:space="preserve">Một trong sáu loại ở bảng 7.2</w:t>
+              <w:t xml:space="preserve">Một trong bảy loại ở bảng 7.2</w:t>
             </w:r>
           </w:p>
         </w:tc>
@@ -8101,7 +8276,7 @@
           <w:sz w:val="20"/>
           <w:szCs w:val="20"/>
         </w:rPr>
-        <w:t xml:space="preserve">Câu hỏi out_of_scope không có dòng nào trong qrels. Hệ thống được tính đúng khi từ chối trả lời.</w:t>
+        <w:t xml:space="preserve">Câu hỏi out_of_scope và unsupported không có dòng nào trong qrels. Hệ thống được tính đúng khi từ chối trả lời.</w:t>
       </w:r>
     </w:p>
     <w:p>
@@ -8205,7 +8380,7 @@
           <w:sz w:val="20"/>
           <w:szCs w:val="20"/>
         </w:rPr>
-        <w:t xml:space="preserve">Lấy ngẫu nhiên khoảng 50 câu hỏi, cho một thành viên khác gán nhãn độc lập.</w:t>
+        <w:t xml:space="preserve">Người gán nhãn phải khác người viết câu hỏi. Lấy ngẫu nhiên khoảng 20% số câu cho hai người gán độc lập.</w:t>
       </w:r>
     </w:p>
     <w:p>
@@ -8223,7 +8398,7 @@
           <w:sz w:val="20"/>
           <w:szCs w:val="20"/>
         </w:rPr>
-        <w:t xml:space="preserve">Tính tỷ lệ đồng thuận ở mức chunk đúng nhất (top relevant chunk trùng nhau). Nếu dưới khoảng 80% thì sửa guideline và gán lại.</w:t>
+        <w:t xml:space="preserve">Tính Cohen kappa trên quyết định liên quan hay không của từng cặp (câu hỏi, chunk). Kappa dưới khoảng 0,6 thì sửa guideline và gán lại; các câu lệch nhau thì họp chốt. Đưa con số kappa vào báo cáo.</w:t>
       </w:r>
     </w:p>
     <w:p>
@@ -8360,7 +8535,7 @@
           <w:sz w:val="20"/>
           <w:szCs w:val="20"/>
         </w:rPr>
-        <w:t xml:space="preserve">Chia theo question_group_id với tỷ lệ gợi ý 60/20/20 cho train, validation, test.</w:t>
+        <w:t xml:space="preserve">Chia theo question_group_id với tỷ lệ gợi ý 40/20/40 cho train, validation, test (khoảng 120/60/120 câu). Train dùng để fine-tune PhoBERT hoặc cross-encoder; nếu nhóm không fine-tune thì gộp train vào test.</w:t>
       </w:r>
     </w:p>
     <w:p>
@@ -8378,7 +8553,7 @@
           <w:sz w:val="20"/>
           <w:szCs w:val="20"/>
         </w:rPr>
-        <w:t xml:space="preserve">Stratify theo type để tập nào cũng có đủ sáu loại, đặc biệt là out_of_scope.</w:t>
+        <w:t xml:space="preserve">Stratify theo type để tập nào cũng có đủ bảy loại, đặc biệt là out_of_scope và unsupported.</w:t>
       </w:r>
     </w:p>
     <w:p>
@@ -8515,7 +8690,7 @@
           <w:sz w:val="20"/>
           <w:szCs w:val="20"/>
         </w:rPr>
-        <w:t xml:space="preserve">Mỗi question_id hợp lệ có ít nhất một dòng qrels, trừ out_of_scope.</w:t>
+        <w:t xml:space="preserve">Mỗi question_id hợp lệ có ít nhất một dòng qrels, trừ out_of_scope và unsupported.</w:t>
       </w:r>
     </w:p>
     <w:p>
@@ -8533,7 +8708,7 @@
           <w:sz w:val="20"/>
           <w:szCs w:val="20"/>
         </w:rPr>
-        <w:t xml:space="preserve">Mọi chunk_id trong qrels tồn tại trong chunks.csv.</w:t>
+        <w:t xml:space="preserve">Mọi chunk_id trong qrels tồn tại trong chunks.jsonl.</w:t>
       </w:r>
     </w:p>
     <w:p>
@@ -8551,7 +8726,7 @@
           <w:sz w:val="20"/>
           <w:szCs w:val="20"/>
         </w:rPr>
-        <w:t xml:space="preserve">Đã kiểm tra đồng thuận nhãn và sửa guideline nếu cần.</w:t>
+        <w:t xml:space="preserve">Đã tính Cohen kappa và sửa guideline nếu cần.</w:t>
       </w:r>
     </w:p>
     <w:p>
@@ -8866,7 +9041,7 @@
           <w:sz w:val="20"/>
           <w:szCs w:val="20"/>
         </w:rPr>
-        <w:t xml:space="preserve">Thử hai mức token: âm tiết (chunks.csv) và từ đã tách (chunks_segmented.csv). Câu hỏi phải tách từ bằng đúng công cụ đã dùng cho chunk.</w:t>
+        <w:t xml:space="preserve">Thử hai mức token: âm tiết (chunk_text) và từ đã tách (text_seg). Câu hỏi phải tách từ bằng đúng công cụ đã dùng cho chunk.</w:t>
       </w:r>
     </w:p>
     <w:p>
@@ -9027,7 +9202,7 @@
           <w:sz w:val="20"/>
           <w:szCs w:val="20"/>
         </w:rPr>
-        <w:t xml:space="preserve">Với out_of_scope: chọn ngưỡng điểm trên validation; dưới ngưỡng thì từ chối. Báo tỷ lệ từ chối đúng và tỷ lệ từ chối nhầm câu hợp lệ.</w:t>
+        <w:t xml:space="preserve">Với out_of_scope và unsupported: chọn ngưỡng điểm trên validation; dưới ngưỡng thì từ chối. Báo tỷ lệ từ chối đúng và tỷ lệ từ chối nhầm câu hợp lệ.</w:t>
       </w:r>
     </w:p>
     <w:p>
@@ -10405,7 +10580,7 @@
           <w:sz w:val="20"/>
           <w:szCs w:val="20"/>
         </w:rPr>
-        <w:t xml:space="preserve">documents.csv có đủ các trường; báo cáo chất lượng kho tài liệu.</w:t>
+        <w:t xml:space="preserve">docs.jsonl có đủ các trường; báo cáo chất lượng kho tài liệu.</w:t>
       </w:r>
     </w:p>
     <w:p>
@@ -10423,7 +10598,7 @@
           <w:sz w:val="20"/>
           <w:szCs w:val="20"/>
         </w:rPr>
-        <w:t xml:space="preserve">chunks.csv và chunks_segmented.csv cùng tập chunk_id; tests pass.</w:t>
+        <w:t xml:space="preserve">chunks.jsonl có chunk_text, text_seg, display_text; tests pass.</w:t>
       </w:r>
     </w:p>
     <w:p>
@@ -10441,7 +10616,7 @@
           <w:sz w:val="20"/>
           <w:szCs w:val="20"/>
         </w:rPr>
-        <w:t xml:space="preserve">questions.csv, qrels.csv, annotation_guideline.md; đủ sáu loại câu hỏi.</w:t>
+        <w:t xml:space="preserve">questions.csv, qrels.csv, annotation_guideline.md; đủ bảy loại câu hỏi.</w:t>
       </w:r>
     </w:p>
     <w:p>
@@ -10459,7 +10634,7 @@
           <w:sz w:val="20"/>
           <w:szCs w:val="20"/>
         </w:rPr>
-        <w:t xml:space="preserve">Báo cáo đồng thuận nhãn.</w:t>
+        <w:t xml:space="preserve">Báo cáo Cohen kappa.</w:t>
       </w:r>
     </w:p>
     <w:p>
@@ -11447,7 +11622,7 @@
                 <w:sz w:val="18"/>
                 <w:szCs w:val="18"/>
               </w:rPr>
-              <w:t xml:space="preserve">10 đến 15% câu out_of_scope</w:t>
+              <w:t xml:space="preserve">Khoảng 10% out_of_scope và 10% unsupported</w:t>
             </w:r>
           </w:p>
         </w:tc>

</xml_diff>

<commit_message>
docs: add step-by-step Git guide for the team, use main as base branch
Co-Authored-By: Claude Opus 5.5 (1M context) <noreply@anthropic.com>
Claude-Session: https://claude.ai/code/session_01J8hW9wVsJvuYjrhXX3hGsR
</commit_message>
<xml_diff>
--- a/docs/files/Huong_dan_Thanh_vien_1_De_tai_10_Dataset_v1.docx
+++ b/docs/files/Huong_dan_Thanh_vien_1_De_tai_10_Dataset_v1.docx
@@ -10336,7 +10336,7 @@
           <w:sz w:val="17"/>
           <w:szCs w:val="17"/>
         </w:rPr>
-        <w:t xml:space="preserve">git switch develop</w:t>
+        <w:t xml:space="preserve">git switch main</w:t>
       </w:r>
     </w:p>
     <w:p>
@@ -10351,7 +10351,7 @@
           <w:sz w:val="17"/>
           <w:szCs w:val="17"/>
         </w:rPr>
-        <w:t xml:space="preserve">git pull --ff-only origin develop</w:t>
+        <w:t xml:space="preserve">git pull --ff-only origin main</w:t>
       </w:r>
     </w:p>
     <w:p>
@@ -10474,7 +10474,7 @@
           <w:sz w:val="20"/>
           <w:szCs w:val="20"/>
         </w:rPr>
-        <w:t xml:space="preserve">Mỗi giai đoạn một nhánh riêng; không commit trực tiếp lên main hoặc develop.</w:t>
+        <w:t xml:space="preserve">Mỗi giai đoạn một nhánh riêng; không commit trực tiếp lên main.</w:t>
       </w:r>
     </w:p>
     <w:p>
@@ -10492,7 +10492,7 @@
           <w:sz w:val="20"/>
           <w:szCs w:val="20"/>
         </w:rPr>
-        <w:t xml:space="preserve">Base branch là develop. Mô tả PR gồm Task ID, thay đổi, lệnh chạy, kết quả và điểm reviewer cần xem.</w:t>
+        <w:t xml:space="preserve">Base branch là main. Hướng dẫn Git từng bước cho cả nhóm: docs/huong-dan-git.md. Mô tả PR gồm Task ID, thay đổi, lệnh chạy, kết quả và điểm reviewer cần xem.</w:t>
       </w:r>
     </w:p>
     <w:p>

</xml_diff>

<commit_message>
docs: them Nghi dinh 123/2015 va Thong tu 04/2020, nguon TVPL khi chi co PDF scan
Cap nhat README, scope, data/README, src/data/README, source_list.csv, lo trinh va huong dan TV1.

Co-Authored-By: Claude Opus 5.5 (1M context) <noreply@anthropic.com>
Claude-Session: https://claude.ai/code/session_01J8hW9wVsJvuYjrhXX3hGsR
</commit_message>
<xml_diff>
--- a/docs/files/Huong_dan_Thanh_vien_1_De_tai_10_Dataset_v1.docx
+++ b/docs/files/Huong_dan_Thanh_vien_1_De_tai_10_Dataset_v1.docx
@@ -92,19 +92,25 @@
         <w:t xml:space="preserve"> </w:t>
       </w:r>
       <w:r>
-        <w:t xml:space="preserve">lĩnh vực hộ tịch. Nguồn là văn bản pháp luật tải</w:t>
-      </w:r>
-      <w:r>
-        <w:t xml:space="preserve"> </w:t>
-      </w:r>
-      <w:r>
-        <w:t xml:space="preserve">tay từ vbpl.vn, bắt đầu từ Luật Hộ tịch 60/2014/QH13 (xem</w:t>
-      </w:r>
-      <w:r>
-        <w:t xml:space="preserve"> </w:t>
-      </w:r>
-      <w:r>
-        <w:t xml:space="preserve">docs/scope.md). Không cào web.</w:t>
+        <w:t xml:space="preserve">lĩnh vực hộ tịch. Kho gồm Luật Hộ tịch</w:t>
+      </w:r>
+      <w:r>
+        <w:t xml:space="preserve"> </w:t>
+      </w:r>
+      <w:r>
+        <w:t xml:space="preserve">60/2014/QH13, Nghị định 123/2015/NĐ-CP và Thông tư 04/2020/TT-BTP (xem</w:t>
+      </w:r>
+      <w:r>
+        <w:t xml:space="preserve"> </w:t>
+      </w:r>
+      <w:r>
+        <w:t xml:space="preserve">docs/scope.md). Tải tay từ vbpl.vn; văn bản chỉ có PDF scan thì lấy toàn</w:t>
+      </w:r>
+      <w:r>
+        <w:t xml:space="preserve"> </w:t>
+      </w:r>
+      <w:r>
+        <w:t xml:space="preserve">văn trên thuvienphapluat.vn. Không cào web.</w:t>
       </w:r>
     </w:p>
     <w:p>
@@ -354,19 +360,19 @@
               <w:jc w:val="left"/>
             </w:pPr>
             <w:r>
-              <w:t xml:space="preserve">Tải văn bản gốc từ vbpl.vn</w:t>
-            </w:r>
-          </w:p>
-        </w:tc>
-        <w:tc>
-          <w:tcPr/>
-          <w:p>
-            <w:pPr>
-              <w:pStyle w:val="Compact"/>
-              <w:jc w:val="left"/>
-            </w:pPr>
-            <w:r>
-              <w:t xml:space="preserve">data/raw/ (.doc, .pdf), bản .docx trong interim/</w:t>
+              <w:t xml:space="preserve">Tải văn bản gốc (vbpl.vn, thuvienphapluat.vn)</w:t>
+            </w:r>
+          </w:p>
+        </w:tc>
+        <w:tc>
+          <w:tcPr/>
+          <w:p>
+            <w:pPr>
+              <w:pStyle w:val="Compact"/>
+              <w:jc w:val="left"/>
+            </w:pPr>
+            <w:r>
+              <w:t xml:space="preserve">data/raw/ (.doc, .pdf, .html), .docx trong interim/</w:t>
             </w:r>
           </w:p>
         </w:tc>
@@ -674,7 +680,7 @@
         <w:rPr>
           <w:rStyle w:val="VerbatimChar"/>
         </w:rPr>
-        <w:t xml:space="preserve">  raw/&lt;so_hieu&gt;.doc, .PDF      file gốc tải từ vbpl.vn</w:t>
+        <w:t xml:space="preserve">  raw/&lt;so_hieu&gt;.doc/.pdf/.html file gốc (vbpl.vn, vanban.chinhphu.vn, TVPL)</w:t>
       </w:r>
       <w:r>
         <w:br/>
@@ -1125,7 +1131,7 @@
               <w:jc w:val="left"/>
             </w:pPr>
             <w:r>
-              <w:t xml:space="preserve">vbpl.vn, Cơ sở dữ liệu quốc gia về văn bản pháp luật</w:t>
+              <w:t xml:space="preserve">vbpl.vn; thuvienphapluat.vn khi văn bản chỉ có PDF scan</w:t>
             </w:r>
           </w:p>
         </w:tc>
@@ -1165,19 +1171,19 @@
               <w:jc w:val="left"/>
             </w:pPr>
             <w:r>
-              <w:t xml:space="preserve">Văn bản đầu tiên</w:t>
-            </w:r>
-          </w:p>
-        </w:tc>
-        <w:tc>
-          <w:tcPr/>
-          <w:p>
-            <w:pPr>
-              <w:pStyle w:val="Compact"/>
-              <w:jc w:val="left"/>
-            </w:pPr>
-            <w:r>
-              <w:t xml:space="preserve">Luật Hộ tịch 60/2014/QH13</w:t>
+              <w:t xml:space="preserve">Văn bản trong kho</w:t>
+            </w:r>
+          </w:p>
+        </w:tc>
+        <w:tc>
+          <w:tcPr/>
+          <w:p>
+            <w:pPr>
+              <w:pStyle w:val="Compact"/>
+              <w:jc w:val="left"/>
+            </w:pPr>
+            <w:r>
+              <w:t xml:space="preserve">Luật 60/2014/QH13, Nghị định 123/2015/NĐ-CP, Thông tư 04/2020/TT-BTP</w:t>
             </w:r>
           </w:p>
         </w:tc>
@@ -1253,19 +1259,25 @@
         </w:numPr>
       </w:pPr>
       <w:r>
-        <w:t xml:space="preserve">Chỉ thêm văn bản khi bộ câu hỏi cần mà Luật không có đáp án, ví dụ chi</w:t>
-      </w:r>
-      <w:r>
-        <w:t xml:space="preserve"> </w:t>
-      </w:r>
-      <w:r>
-        <w:t xml:space="preserve">tiết hồ sơ, lệ phí, thời hạn thường nằm ở nghị định hoặc thông tư</w:t>
-      </w:r>
-      <w:r>
-        <w:t xml:space="preserve"> </w:t>
-      </w:r>
-      <w:r>
-        <w:t xml:space="preserve">hướng dẫn.</w:t>
+        <w:t xml:space="preserve">Chi tiết hồ sơ, giấy tờ, cách làm từng trường hợp thường nằm ở nghị</w:t>
+      </w:r>
+      <w:r>
+        <w:t xml:space="preserve"> </w:t>
+      </w:r>
+      <w:r>
+        <w:t xml:space="preserve">định và thông tư hướng dẫn, nên kho đã có Nghị định 123/2015 và Thông</w:t>
+      </w:r>
+      <w:r>
+        <w:t xml:space="preserve"> </w:t>
+      </w:r>
+      <w:r>
+        <w:t xml:space="preserve">tư 04/2020. Chỉ thêm văn bản khác khi bộ câu hỏi cần mà 3 văn bản này</w:t>
+      </w:r>
+      <w:r>
+        <w:t xml:space="preserve"> </w:t>
+      </w:r>
+      <w:r>
+        <w:t xml:space="preserve">không có đáp án.</w:t>
       </w:r>
     </w:p>
     <w:p>
@@ -1375,7 +1387,7 @@
               <w:jc w:val="left"/>
             </w:pPr>
             <w:r>
-              <w:t xml:space="preserve">Số hiệu văn bản, ví dụ 60.2014.QH13; không đổi về sau</w:t>
+              <w:t xml:space="preserve">Số hiệu viết không dấu, ví dụ 60.2014.QH13, 123.2015.ND-CP; không đổi về sau</w:t>
             </w:r>
           </w:p>
         </w:tc>
@@ -1453,7 +1465,7 @@
               <w:jc w:val="left"/>
             </w:pPr>
             <w:r>
-              <w:t xml:space="preserve">Đường dẫn trang văn bản trên vbpl.vn</w:t>
+              <w:t xml:space="preserve">Đường dẫn trang văn bản đã lấy chữ (vbpl.vn hoặc thuvienphapluat.vn)</w:t>
             </w:r>
           </w:p>
         </w:tc>
@@ -1479,7 +1491,7 @@
               <w:jc w:val="left"/>
             </w:pPr>
             <w:r>
-              <w:t xml:space="preserve">Cơ quan ban hành, ví dụ Quốc hội</w:t>
+              <w:t xml:space="preserve">Cơ quan ban hành: Quốc hội, Chính phủ, Bộ Tư pháp</w:t>
             </w:r>
           </w:p>
         </w:tc>
@@ -1600,6 +1612,68 @@
       </w:r>
       <w:r>
         <w:t xml:space="preserve">Không đổi tên hay sửa nội dung file gốc.</w:t>
+      </w:r>
+    </w:p>
+    <w:p>
+      <w:pPr>
+        <w:numPr>
+          <w:ilvl w:val="0"/>
+          <w:numId w:val="1000"/>
+        </w:numPr>
+      </w:pPr>
+      <w:r>
+        <w:t xml:space="preserve">Nếu chỉ có PDF scan (ví dụ file .signed.pdf của vanban.chinhphu.vn:</w:t>
+      </w:r>
+      <w:r>
+        <w:t xml:space="preserve"> </w:t>
+      </w:r>
+      <w:r>
+        <w:t xml:space="preserve">chuyển sang text chỉ ra dòng</w:t>
+      </w:r>
+      <w:r>
+        <w:t xml:space="preserve"> </w:t>
+      </w:r>
+      <w:r>
+        <w:t xml:space="preserve">“</w:t>
+      </w:r>
+      <w:r>
+        <w:t xml:space="preserve">Ký bởi…</w:t>
+      </w:r>
+      <w:r>
+        <w:t xml:space="preserve">”</w:t>
+      </w:r>
+      <w:r>
+        <w:t xml:space="preserve"> </w:t>
+      </w:r>
+      <w:r>
+        <w:t xml:space="preserve">của chữ ký số), thì vẫn giữ</w:t>
+      </w:r>
+      <w:r>
+        <w:t xml:space="preserve"> </w:t>
+      </w:r>
+      <w:r>
+        <w:t xml:space="preserve">file scan trong data/raw để đối chiếu, rồi mở văn bản trên</w:t>
+      </w:r>
+      <w:r>
+        <w:t xml:space="preserve"> </w:t>
+      </w:r>
+      <w:r>
+        <w:t xml:space="preserve">thuvienphapluat.vn: Ctrl+S lưu trang thành data/raw/</w:t>
+      </w:r>
+      <w:r>
+        <w:t xml:space="preserve">.html,</w:t>
+      </w:r>
+      <w:r>
+        <w:t xml:space="preserve"> </w:t>
+      </w:r>
+      <w:r>
+        <w:t xml:space="preserve">và copy phần toàn văn (dán vào Word chọn Keep Text Only) để làm bản</w:t>
+      </w:r>
+      <w:r>
+        <w:t xml:space="preserve"> </w:t>
+      </w:r>
+      <w:r>
+        <w:t xml:space="preserve">.docx. Không cào TVPL bằng code.</w:t>
       </w:r>
     </w:p>
     <w:p>
@@ -1668,7 +1742,7 @@
         <w:t xml:space="preserve"> </w:t>
       </w:r>
       <w:r>
-        <w:t xml:space="preserve">trang văn bản trên vbpl.vn.</w:t>
+        <w:t xml:space="preserve">trang văn bản trên vbpl.vn hoặc thuvienphapluat.vn.</w:t>
       </w:r>
       <w:r>
         <w:t xml:space="preserve"> </w:t>
@@ -5532,7 +5606,7 @@
         </w:numPr>
       </w:pPr>
       <w:r>
-        <w:t xml:space="preserve">source_list.csv đầy đủ số hiệu, URL vbpl.vn, ngày tải, tình trạng hiệu lực.</w:t>
+        <w:t xml:space="preserve">source_list.csv đủ 3 văn bản: số hiệu, URL, ngày tải, tình trạng hiệu lực.</w:t>
       </w:r>
     </w:p>
     <w:p>

</xml_diff>

<commit_message>
docs: kho 10 van ban luat, tach legal_basis thanh amended_by va affected_by
- source_list.csv: them NĐ 18/2026 va TT 09/2022, cot amended_by/affected_by
- scope.md, data/README.md, README, lo trinh, huong dan TV1 (+docx) cap nhat theo 10 van ban
- data/raw: html trang TVPL cua 7 van ban; data/interim: docx 09.2022, 18.2026 tu vbpl

Co-Authored-By: Claude Opus 5.5 (1M context) <noreply@anthropic.com>
Claude-Session: https://claude.ai/code/session_01J8hW9wVsJvuYjrhXX3hGsR
</commit_message>
<xml_diff>
--- a/docs/files/Huong_dan_Thanh_vien_1_De_tai_10_Dataset_v1.docx
+++ b/docs/files/Huong_dan_Thanh_vien_1_De_tai_10_Dataset_v1.docx
@@ -2,7 +2,7 @@
 <file path=word/document.xml><?xml version="1.0" encoding="utf-8"?>
 <w:document xmlns:w="http://schemas.openxmlformats.org/wordprocessingml/2006/main" xmlns:m="http://schemas.openxmlformats.org/officeDocument/2006/math" xmlns:r="http://schemas.openxmlformats.org/officeDocument/2006/relationships" xmlns:o="urn:schemas-microsoft-com:office:office" xmlns:v="urn:schemas-microsoft-com:vml" xmlns:w10="urn:schemas-microsoft-com:office:word" xmlns:a="http://schemas.openxmlformats.org/drawingml/2006/main" xmlns:pic="http://schemas.openxmlformats.org/drawingml/2006/picture" xmlns:wp="http://schemas.openxmlformats.org/drawingml/2006/wordprocessingDrawing">
   <w:body>
-    <w:bookmarkStart w:id="55" w:name="hướng-dẫn-công-việc-thành-viên-1"/>
+    <w:bookmarkStart w:id="56" w:name="hướng-dẫn-công-việc-thành-viên-1"/>
     <w:p>
       <w:pPr>
         <w:pStyle w:val="Heading1"/>
@@ -92,19 +92,31 @@
         <w:t xml:space="preserve"> </w:t>
       </w:r>
       <w:r>
-        <w:t xml:space="preserve">lĩnh vực hộ tịch. Kho gồm Luật Hộ tịch</w:t>
-      </w:r>
-      <w:r>
-        <w:t xml:space="preserve"> </w:t>
-      </w:r>
-      <w:r>
-        <w:t xml:space="preserve">60/2014/QH13, Nghị định 123/2015/NĐ-CP và Thông tư 04/2020/TT-BTP (xem</w:t>
-      </w:r>
-      <w:r>
-        <w:t xml:space="preserve"> </w:t>
-      </w:r>
-      <w:r>
-        <w:t xml:space="preserve">docs/scope.md). Tải tay từ vbpl.vn; văn bản chỉ có PDF scan thì lấy toàn</w:t>
+        <w:t xml:space="preserve">lĩnh vực hộ tịch. Kho gồm 10 văn bản: Luật Hộ tịch</w:t>
+      </w:r>
+      <w:r>
+        <w:t xml:space="preserve"> </w:t>
+      </w:r>
+      <w:r>
+        <w:t xml:space="preserve">60/2014/QH13, Nghị định 123/2015/NĐ-CP, Thông tư 04/2020/TT-BTP và các</w:t>
+      </w:r>
+      <w:r>
+        <w:t xml:space="preserve"> </w:t>
+      </w:r>
+      <w:r>
+        <w:t xml:space="preserve">văn bản sửa đổi, hướng dẫn liên quan (danh sách trong</w:t>
+      </w:r>
+      <w:r>
+        <w:t xml:space="preserve"> </w:t>
+      </w:r>
+      <w:r>
+        <w:t xml:space="preserve">data/raw/source_list.csv, lý do trong docs/scope.md). Kho phản ánh</w:t>
+      </w:r>
+      <w:r>
+        <w:t xml:space="preserve"> </w:t>
+      </w:r>
+      <w:r>
+        <w:t xml:space="preserve">quy định có hiệu lực tại 09/10/2026, dùng được đến 28/02/2027. Tải tay từ vbpl.vn; văn bản chỉ có PDF scan thì lấy toàn</w:t>
       </w:r>
       <w:r>
         <w:t xml:space="preserve"> </w:t>
@@ -1183,7 +1195,33 @@
               <w:jc w:val="left"/>
             </w:pPr>
             <w:r>
-              <w:t xml:space="preserve">Luật 60/2014/QH13, Nghị định 123/2015/NĐ-CP, Thông tư 04/2020/TT-BTP</w:t>
+              <w:t xml:space="preserve">10 văn bản: Luật 60/2014, NĐ 123/2015, TT 04/2020, NĐ 87/2020 và 6 văn bản sửa đổi, ảnh hưởng hiệu lực (xem source_list.csv)</w:t>
+            </w:r>
+          </w:p>
+        </w:tc>
+      </w:tr>
+      <w:tr>
+        <w:tc>
+          <w:tcPr/>
+          <w:p>
+            <w:pPr>
+              <w:pStyle w:val="Compact"/>
+              <w:jc w:val="left"/>
+            </w:pPr>
+            <w:r>
+              <w:t xml:space="preserve">Văn bản sửa đổi</w:t>
+            </w:r>
+          </w:p>
+        </w:tc>
+        <w:tc>
+          <w:tcPr/>
+          <w:p>
+            <w:pPr>
+              <w:pStyle w:val="Compact"/>
+              <w:jc w:val="left"/>
+            </w:pPr>
+            <w:r>
+              <w:t xml:space="preserve">Không chunk riêng; áp vào văn bản gốc qua data/raw/amendments.yaml (mục 5.4)</w:t>
             </w:r>
           </w:p>
         </w:tc>
@@ -1271,7 +1309,7 @@
         <w:t xml:space="preserve"> </w:t>
       </w:r>
       <w:r>
-        <w:t xml:space="preserve">tư 04/2020. Chỉ thêm văn bản khác khi bộ câu hỏi cần mà 3 văn bản này</w:t>
+        <w:t xml:space="preserve">tư 04/2020. Chỉ thêm văn bản khác khi bộ câu hỏi cần mà kho hiện tại</w:t>
       </w:r>
       <w:r>
         <w:t xml:space="preserve"> </w:t>
@@ -1505,19 +1543,97 @@
               <w:jc w:val="left"/>
             </w:pPr>
             <w:r>
-              <w:t xml:space="preserve">legal_basis</w:t>
-            </w:r>
-          </w:p>
-        </w:tc>
-        <w:tc>
-          <w:tcPr/>
-          <w:p>
-            <w:pPr>
-              <w:pStyle w:val="Compact"/>
-              <w:jc w:val="left"/>
-            </w:pPr>
-            <w:r>
-              <w:t xml:space="preserve">Văn bản sửa đổi, bổ sung (nếu có)</w:t>
+              <w:t xml:space="preserve">amended_by</w:t>
+            </w:r>
+          </w:p>
+        </w:tc>
+        <w:tc>
+          <w:tcPr/>
+          <w:p>
+            <w:pPr>
+              <w:pStyle w:val="Compact"/>
+              <w:jc w:val="left"/>
+            </w:pPr>
+            <w:r>
+              <w:t xml:space="preserve">Văn bản sửa câu chữ văn bản này (nếu có), ghi doc_id, nhiều văn bản cách nhau dấu ;, ví dụ 87.2020.ND-CP;07.2025.ND-CP. Là nguồn để viết amendments.yaml</w:t>
+            </w:r>
+          </w:p>
+        </w:tc>
+      </w:tr>
+      <w:tr>
+        <w:tc>
+          <w:tcPr/>
+          <w:p>
+            <w:pPr>
+              <w:pStyle w:val="Compact"/>
+              <w:jc w:val="left"/>
+            </w:pPr>
+            <w:r>
+              <w:t xml:space="preserve">affected_by</w:t>
+            </w:r>
+          </w:p>
+        </w:tc>
+        <w:tc>
+          <w:tcPr/>
+          <w:p>
+            <w:pPr>
+              <w:pStyle w:val="Compact"/>
+              <w:jc w:val="left"/>
+            </w:pPr>
+            <w:r>
+              <w:t xml:space="preserve">Văn bản đổi hiệu lực, thẩm quyền, thời hạn mà không sửa câu chữ (nếu có), ví dụ 120.2025.ND-CP</w:t>
+            </w:r>
+          </w:p>
+        </w:tc>
+      </w:tr>
+      <w:tr>
+        <w:tc>
+          <w:tcPr/>
+          <w:p>
+            <w:pPr>
+              <w:pStyle w:val="Compact"/>
+              <w:jc w:val="left"/>
+            </w:pPr>
+            <w:r>
+              <w:t xml:space="preserve">effective_date</w:t>
+            </w:r>
+          </w:p>
+        </w:tc>
+        <w:tc>
+          <w:tcPr/>
+          <w:p>
+            <w:pPr>
+              <w:pStyle w:val="Compact"/>
+              <w:jc w:val="left"/>
+            </w:pPr>
+            <w:r>
+              <w:t xml:space="preserve">Ngày văn bản có hiệu lực, định dạng YYYY-MM-DD</w:t>
+            </w:r>
+          </w:p>
+        </w:tc>
+      </w:tr>
+      <w:tr>
+        <w:tc>
+          <w:tcPr/>
+          <w:p>
+            <w:pPr>
+              <w:pStyle w:val="Compact"/>
+              <w:jc w:val="left"/>
+            </w:pPr>
+            <w:r>
+              <w:t xml:space="preserve">status</w:t>
+            </w:r>
+          </w:p>
+        </w:tc>
+        <w:tc>
+          <w:tcPr/>
+          <w:p>
+            <w:pPr>
+              <w:pStyle w:val="Compact"/>
+              <w:jc w:val="left"/>
+            </w:pPr>
+            <w:r>
+              <w:t xml:space="preserve">Tình trạng hiệu lực tại ngày tải, ghi theo tab hiệu lực của trang nguồn: Còn hiệu lực, Hết hiệu lực một phần, Hết hiệu lực</w:t>
             </w:r>
           </w:p>
         </w:tc>
@@ -1690,7 +1806,22 @@
         <w:t xml:space="preserve"> </w:t>
       </w:r>
       <w:r>
-        <w:t xml:space="preserve">data/interim. Code chỉ đọc bản .docx.</w:t>
+        <w:t xml:space="preserve">data/interim/</w:t>
+      </w:r>
+      <w:r>
+        <w:t xml:space="preserve">.docx. Văn bản lấy từ TVPL thì copy phần toàn</w:t>
+      </w:r>
+      <w:r>
+        <w:t xml:space="preserve"> </w:t>
+      </w:r>
+      <w:r>
+        <w:t xml:space="preserve">văn, dán vào Word bằng Keep Text Only rồi lưu cùng chỗ. Code chỉ đọc</w:t>
+      </w:r>
+      <w:r>
+        <w:t xml:space="preserve"> </w:t>
+      </w:r>
+      <w:r>
+        <w:t xml:space="preserve">bản .docx, không đọc html.</w:t>
       </w:r>
     </w:p>
     <w:p>
@@ -1718,13 +1849,34 @@
         </w:numPr>
       </w:pPr>
       <w:r>
-        <w:t xml:space="preserve">Mở bản .docx kiểm tra: đủ số Điều, không mất bảng, không lẫn chú</w:t>
-      </w:r>
-      <w:r>
-        <w:t xml:space="preserve"> </w:t>
-      </w:r>
-      <w:r>
-        <w:t xml:space="preserve">thích hay header trang.</w:t>
+        <w:t xml:space="preserve">Mở bản .docx kiểm tra: đủ số Điều (ví dụ NĐ 123: 45, TT 04/2020:</w:t>
+      </w:r>
+      <w:r>
+        <w:t xml:space="preserve"> </w:t>
+      </w:r>
+      <w:r>
+        <w:t xml:space="preserve">39), không mất bảng, không lẫn chú thích, header trang, ô</w:t>
+      </w:r>
+      <w:r>
+        <w:t xml:space="preserve"> </w:t>
+      </w:r>
+      <w:r>
+        <w:t xml:space="preserve">“</w:t>
+      </w:r>
+      <w:r>
+        <w:t xml:space="preserve">Từ khóa</w:t>
+      </w:r>
+      <w:r>
+        <w:t xml:space="preserve">”</w:t>
+      </w:r>
+      <w:r>
+        <w:t xml:space="preserve">,</w:t>
+      </w:r>
+      <w:r>
+        <w:t xml:space="preserve"> </w:t>
+      </w:r>
+      <w:r>
+        <w:t xml:space="preserve">danh sách văn bản liên quan hay quảng cáo của trang nguồn.</w:t>
       </w:r>
     </w:p>
     <w:p>
@@ -1768,7 +1920,7 @@
       </w:r>
     </w:p>
     <w:bookmarkEnd w:id="27"/>
-    <w:bookmarkStart w:id="31" w:name="d02-tách-cấu-trúc-làm-sạch-và-eda"/>
+    <w:bookmarkStart w:id="32" w:name="d02-tách-cấu-trúc-làm-sạch-và-eda"/>
     <w:p>
       <w:pPr>
         <w:pStyle w:val="Heading2"/>
@@ -1915,6 +2067,32 @@
               <w:jc w:val="left"/>
             </w:pPr>
             <w:r>
+              <w:t xml:space="preserve">muc</w:t>
+            </w:r>
+          </w:p>
+        </w:tc>
+        <w:tc>
+          <w:tcPr/>
+          <w:p>
+            <w:pPr>
+              <w:pStyle w:val="Compact"/>
+              <w:jc w:val="left"/>
+            </w:pPr>
+            <w:r>
+              <w:t xml:space="preserve">Mục 1. Đăng ký khai sinh (để trống nếu không có)</w:t>
+            </w:r>
+          </w:p>
+        </w:tc>
+      </w:tr>
+      <w:tr>
+        <w:tc>
+          <w:tcPr/>
+          <w:p>
+            <w:pPr>
+              <w:pStyle w:val="Compact"/>
+              <w:jc w:val="left"/>
+            </w:pPr>
+            <w:r>
               <w:t xml:space="preserve">dieu</w:t>
             </w:r>
           </w:p>
@@ -1927,8 +2105,35 @@
               <w:jc w:val="left"/>
             </w:pPr>
             <w:r>
+              <w:t xml:space="preserve">“</w:t>
+            </w:r>
+            <w:r>
               <w:t xml:space="preserve">16</w:t>
             </w:r>
+            <w:r>
+              <w:t xml:space="preserve">”</w:t>
+            </w:r>
+            <w:r>
+              <w:t xml:space="preserve">,</w:t>
+            </w:r>
+            <w:r>
+              <w:t xml:space="preserve"> </w:t>
+            </w:r>
+            <w:r>
+              <w:t xml:space="preserve">“</w:t>
+            </w:r>
+            <w:r>
+              <w:t xml:space="preserve">28a</w:t>
+            </w:r>
+            <w:r>
+              <w:t xml:space="preserve">”</w:t>
+            </w:r>
+            <w:r>
+              <w:t xml:space="preserve"> </w:t>
+            </w:r>
+            <w:r>
+              <w:t xml:space="preserve">(lưu dạng chuỗi)</w:t>
+            </w:r>
           </w:p>
         </w:tc>
       </w:tr>
@@ -1993,6 +2198,32 @@
               <w:jc w:val="left"/>
             </w:pPr>
             <w:r>
+              <w:t xml:space="preserve">diem</w:t>
+            </w:r>
+          </w:p>
+        </w:tc>
+        <w:tc>
+          <w:tcPr/>
+          <w:p>
+            <w:pPr>
+              <w:pStyle w:val="Compact"/>
+              <w:jc w:val="left"/>
+            </w:pPr>
+            <w:r>
+              <w:t xml:space="preserve">a, b, c, đ… (để trống nếu Khoản không chia điểm)</w:t>
+            </w:r>
+          </w:p>
+        </w:tc>
+      </w:tr>
+      <w:tr>
+        <w:tc>
+          <w:tcPr/>
+          <w:p>
+            <w:pPr>
+              <w:pStyle w:val="Compact"/>
+              <w:jc w:val="left"/>
+            </w:pPr>
+            <w:r>
               <w:t xml:space="preserve">noi_dung</w:t>
             </w:r>
           </w:p>
@@ -2031,6 +2262,30 @@
         <w:t xml:space="preserve">”</w:t>
       </w:r>
       <w:r>
+        <w:t xml:space="preserve"> </w:t>
+      </w:r>
+      <w:r>
+        <w:t xml:space="preserve">(không phân biệt hoa thường),</w:t>
+      </w:r>
+      <w:r>
+        <w:t xml:space="preserve"> </w:t>
+      </w:r>
+      <w:r>
+        <w:t xml:space="preserve">“</w:t>
+      </w:r>
+      <w:r>
+        <w:t xml:space="preserve">Mục</w:t>
+      </w:r>
+      <w:r>
+        <w:t xml:space="preserve"> </w:t>
+      </w:r>
+      <w:r>
+        <w:t xml:space="preserve">.</w:t>
+      </w:r>
+      <w:r>
+        <w:t xml:space="preserve">”</w:t>
+      </w:r>
+      <w:r>
         <w:t xml:space="preserve">,</w:t>
       </w:r>
       <w:r>
@@ -2040,13 +2295,37 @@
         <w:t xml:space="preserve">“</w:t>
       </w:r>
       <w:r>
-        <w:t xml:space="preserve">Mục</w:t>
+        <w:t xml:space="preserve">Điều</w:t>
+      </w:r>
+      <w:r>
+        <w:t xml:space="preserve"> </w:t>
+      </w:r>
+      <w:r>
+        <w:t xml:space="preserve">.</w:t>
       </w:r>
       <w:r>
         <w:t xml:space="preserve">”</w:t>
       </w:r>
       <w:r>
-        <w:t xml:space="preserve">,</w:t>
+        <w:t xml:space="preserve"> </w:t>
+      </w:r>
+      <w:r>
+        <w:t xml:space="preserve">với số có thể kèm chữ (regex</w:t>
+      </w:r>
+      <w:r>
+        <w:t xml:space="preserve"> </w:t>
+      </w:r>
+      <w:r>
+        <w:rPr>
+          <w:rStyle w:val="VerbatimChar"/>
+        </w:rPr>
+        <w:t xml:space="preserve">(\d+[a-z]?)</w:t>
+      </w:r>
+      <w:r>
+        <w:t xml:space="preserve"> </w:t>
+      </w:r>
+      <w:r>
+        <w:t xml:space="preserve">để bắt Điều 28a),</w:t>
       </w:r>
       <w:r>
         <w:t xml:space="preserve"> </w:t>
@@ -2055,19 +2334,16 @@
         <w:t xml:space="preserve">“</w:t>
       </w:r>
       <w:r>
-        <w:t xml:space="preserve">Điều</w:t>
-      </w:r>
-      <w:r>
-        <w:t xml:space="preserve"> </w:t>
-      </w:r>
-      <w:r>
         <w:t xml:space="preserve">.</w:t>
       </w:r>
       <w:r>
         <w:t xml:space="preserve">”</w:t>
       </w:r>
       <w:r>
-        <w:t xml:space="preserve">,</w:t>
+        <w:t xml:space="preserve"> </w:t>
+      </w:r>
+      <w:r>
+        <w:t xml:space="preserve">cho khoản,</w:t>
       </w:r>
       <w:r>
         <w:t xml:space="preserve"> </w:t>
@@ -2076,7 +2352,7 @@
         <w:t xml:space="preserve">“</w:t>
       </w:r>
       <w:r>
-        <w:t xml:space="preserve">.</w:t>
+        <w:t xml:space="preserve">)</w:t>
       </w:r>
       <w:r>
         <w:t xml:space="preserve">”</w:t>
@@ -2085,31 +2361,21 @@
         <w:t xml:space="preserve"> </w:t>
       </w:r>
       <w:r>
-        <w:t xml:space="preserve">cho</w:t>
-      </w:r>
-      <w:r>
-        <w:t xml:space="preserve"> </w:t>
-      </w:r>
-      <w:r>
-        <w:t xml:space="preserve">khoản,</w:t>
-      </w:r>
-      <w:r>
-        <w:t xml:space="preserve"> </w:t>
-      </w:r>
-      <w:r>
-        <w:t xml:space="preserve">“</w:t>
-      </w:r>
-      <w:r>
-        <w:t xml:space="preserve">)</w:t>
-      </w:r>
-      <w:r>
-        <w:t xml:space="preserve">”</w:t>
-      </w:r>
-      <w:r>
-        <w:t xml:space="preserve"> </w:t>
-      </w:r>
-      <w:r>
         <w:t xml:space="preserve">cho điểm.</w:t>
+      </w:r>
+    </w:p>
+    <w:p>
+      <w:pPr>
+        <w:pStyle w:val="BodyText"/>
+      </w:pPr>
+      <w:r>
+        <w:t xml:space="preserve">Kiểm tra tối thiểu: NĐ 123 ra 45 Điều, Luật 60 ra 77 Điều, Điều 12</w:t>
+      </w:r>
+      <w:r>
+        <w:t xml:space="preserve"> </w:t>
+      </w:r>
+      <w:r>
+        <w:t xml:space="preserve">NĐ 123 có 4 khoản, Điều 4 khoản 1 NĐ 123 có điểm c.</w:t>
       </w:r>
     </w:p>
     <w:bookmarkEnd w:id="28"/>
@@ -2540,8 +2806,145 @@
       </w:r>
     </w:p>
     <w:bookmarkEnd w:id="30"/>
+    <w:bookmarkStart w:id="31" w:name="áp-văn-bản-sửa-đổi-amendments.yaml"/>
+    <w:p>
+      <w:pPr>
+        <w:pStyle w:val="Heading3"/>
+      </w:pPr>
+      <w:r>
+        <w:t xml:space="preserve">5.4 Áp văn bản sửa đổi (amendments.yaml)</w:t>
+      </w:r>
+    </w:p>
+    <w:p>
+      <w:pPr>
+        <w:pStyle w:val="FirstParagraph"/>
+      </w:pPr>
+      <w:r>
+        <w:t xml:space="preserve">Văn bản sửa đổi (07/2025/NĐ-CP, 04/2024/TT-BTP…) viết kiểu</w:t>
+      </w:r>
+      <w:r>
+        <w:t xml:space="preserve"> </w:t>
+      </w:r>
+      <w:r>
+        <w:t xml:space="preserve">“</w:t>
+      </w:r>
+      <w:r>
+        <w:t xml:space="preserve">sửa Điều X</w:t>
+      </w:r>
+      <w:r>
+        <w:t xml:space="preserve"> </w:t>
+      </w:r>
+      <w:r>
+        <w:t xml:space="preserve">thành: …</w:t>
+      </w:r>
+      <w:r>
+        <w:t xml:space="preserve">”</w:t>
+      </w:r>
+      <w:r>
+        <w:t xml:space="preserve">, chunk nguyên văn thì đoạn rất khó hiểu và dễ trả về Điều</w:t>
+      </w:r>
+      <w:r>
+        <w:t xml:space="preserve"> </w:t>
+      </w:r>
+      <w:r>
+        <w:t xml:space="preserve">cũ đã bị sửa. Vì vậy kho dùng bản hợp nhất:</w:t>
+      </w:r>
+    </w:p>
+    <w:p>
+      <w:pPr>
+        <w:numPr>
+          <w:ilvl w:val="0"/>
+          <w:numId w:val="1006"/>
+        </w:numPr>
+      </w:pPr>
+      <w:r>
+        <w:t xml:space="preserve">Đọc phần sửa đổi trong văn bản sửa đổi, mỗi thay đổi ghi thành một</w:t>
+      </w:r>
+      <w:r>
+        <w:t xml:space="preserve"> </w:t>
+      </w:r>
+      <w:r>
+        <w:t xml:space="preserve">dòng trong data/raw/amendments.yaml: văn bản sửa đổi, văn bản bị</w:t>
+      </w:r>
+      <w:r>
+        <w:t xml:space="preserve"> </w:t>
+      </w:r>
+      <w:r>
+        <w:t xml:space="preserve">sửa, vị trí (Điều, Khoản, Điểm), kiểu thao tác, câu chữ mới.</w:t>
+      </w:r>
+    </w:p>
+    <w:p>
+      <w:pPr>
+        <w:numPr>
+          <w:ilvl w:val="0"/>
+          <w:numId w:val="1006"/>
+        </w:numPr>
+      </w:pPr>
+      <w:r>
+        <w:t xml:space="preserve">10 kiểu thao tác: replace_dieu, replace_khoan, replace_diem,</w:t>
+      </w:r>
+      <w:r>
+        <w:t xml:space="preserve"> </w:t>
+      </w:r>
+      <w:r>
+        <w:t xml:space="preserve">insert_khoan, insert_dieu, rename_dieu, repeal, remove_phrase,</w:t>
+      </w:r>
+      <w:r>
+        <w:t xml:space="preserve"> </w:t>
+      </w:r>
+      <w:r>
+        <w:t xml:space="preserve">replace_phrase, note. Thay đổi không sửa câu chữ (bỏ sổ hộ khẩu,</w:t>
+      </w:r>
+      <w:r>
+        <w:t xml:space="preserve"> </w:t>
+      </w:r>
+      <w:r>
+        <w:t xml:space="preserve">thẩm quyền theo chính quyền 2 cấp) ghi bằng note, gắn ghi chú vào</w:t>
+      </w:r>
+      <w:r>
+        <w:t xml:space="preserve"> </w:t>
+      </w:r>
+      <w:r>
+        <w:t xml:space="preserve">Điều liên quan.</w:t>
+      </w:r>
+    </w:p>
+    <w:p>
+      <w:pPr>
+        <w:numPr>
+          <w:ilvl w:val="0"/>
+          <w:numId w:val="1006"/>
+        </w:numPr>
+      </w:pPr>
+      <w:r>
+        <w:t xml:space="preserve">Chép câu chữ thì bỏ dấu “ ” ở đầu và cuối đoạn trích. Bãi bỏ thì</w:t>
+      </w:r>
+      <w:r>
+        <w:t xml:space="preserve"> </w:t>
+      </w:r>
+      <w:r>
+        <w:t xml:space="preserve">không đánh số lại Khoản.</w:t>
+      </w:r>
+    </w:p>
+    <w:p>
+      <w:pPr>
+        <w:numPr>
+          <w:ilvl w:val="0"/>
+          <w:numId w:val="1006"/>
+        </w:numPr>
+      </w:pPr>
+      <w:r>
+        <w:t xml:space="preserve">Code áp amendments.yaml sau bước tách cấu trúc, trước bước chunk.</w:t>
+      </w:r>
+      <w:r>
+        <w:t xml:space="preserve"> </w:t>
+      </w:r>
+      <w:r>
+        <w:t xml:space="preserve">Đoạn bị sửa ghi lại amended_by để hiển thị nguồn.</w:t>
+      </w:r>
+    </w:p>
     <w:bookmarkEnd w:id="31"/>
-    <w:bookmarkStart w:id="34" w:name="d03-chia-đoạn-chunking"/>
+    <w:bookmarkEnd w:id="32"/>
+    <w:bookmarkStart w:id="35" w:name="d03-chia-đoạn-chunking"/>
     <w:p>
       <w:pPr>
         <w:pStyle w:val="Heading2"/>
@@ -2568,7 +2971,7 @@
       <w:pPr>
         <w:numPr>
           <w:ilvl w:val="0"/>
-          <w:numId w:val="1006"/>
+          <w:numId w:val="1007"/>
         </w:numPr>
       </w:pPr>
       <w:r>
@@ -2579,7 +2982,7 @@
       <w:pPr>
         <w:numPr>
           <w:ilvl w:val="0"/>
-          <w:numId w:val="1006"/>
+          <w:numId w:val="1007"/>
         </w:numPr>
       </w:pPr>
       <w:r>
@@ -2602,7 +3005,7 @@
       <w:pPr>
         <w:numPr>
           <w:ilvl w:val="0"/>
-          <w:numId w:val="1006"/>
+          <w:numId w:val="1007"/>
         </w:numPr>
       </w:pPr>
       <w:r>
@@ -2640,7 +3043,7 @@
       <w:pPr>
         <w:numPr>
           <w:ilvl w:val="0"/>
-          <w:numId w:val="1006"/>
+          <w:numId w:val="1007"/>
         </w:numPr>
       </w:pPr>
       <w:r>
@@ -2650,20 +3053,20 @@
         <w:t xml:space="preserve"> </w:t>
       </w:r>
       <w:r>
-        <w:t xml:space="preserve">60.2014.QH13__D16__K1. Không dùng số dòng làm ID. Format cuối</w:t>
-      </w:r>
-      <w:r>
-        <w:t xml:space="preserve"> </w:t>
-      </w:r>
-      <w:r>
-        <w:t xml:space="preserve">cùng chốt theo notebook 01_doc_luat.</w:t>
-      </w:r>
-    </w:p>
-    <w:p>
-      <w:pPr>
-        <w:numPr>
-          <w:ilvl w:val="0"/>
-          <w:numId w:val="1006"/>
+        <w:t xml:space="preserve">60.2014.QH13__D16__K1 hoặc 123.2015.ND-CP__D28a. Không dùng</w:t>
+      </w:r>
+      <w:r>
+        <w:t xml:space="preserve"> </w:t>
+      </w:r>
+      <w:r>
+        <w:t xml:space="preserve">số dòng làm ID. Format cuối cùng chốt theo notebook 01_doc_luat.</w:t>
+      </w:r>
+    </w:p>
+    <w:p>
+      <w:pPr>
+        <w:numPr>
+          <w:ilvl w:val="0"/>
+          <w:numId w:val="1007"/>
         </w:numPr>
       </w:pPr>
       <w:r>
@@ -2771,7 +3174,33 @@
               <w:jc w:val="left"/>
             </w:pPr>
             <w:r>
-              <w:t xml:space="preserve">Thuộc văn bản nào, Điều nào, Khoản nào</w:t>
+              <w:t xml:space="preserve">Thuộc văn bản nào, Điều nào (chuỗi), Khoản nào</w:t>
+            </w:r>
+          </w:p>
+        </w:tc>
+      </w:tr>
+      <w:tr>
+        <w:tc>
+          <w:tcPr/>
+          <w:p>
+            <w:pPr>
+              <w:pStyle w:val="Compact"/>
+              <w:jc w:val="left"/>
+            </w:pPr>
+            <w:r>
+              <w:t xml:space="preserve">amended_by</w:t>
+            </w:r>
+          </w:p>
+        </w:tc>
+        <w:tc>
+          <w:tcPr/>
+          <w:p>
+            <w:pPr>
+              <w:pStyle w:val="Compact"/>
+              <w:jc w:val="left"/>
+            </w:pPr>
+            <w:r>
+              <w:t xml:space="preserve">Các văn bản đã sửa đoạn này (rỗng nếu chưa bị sửa)</w:t>
             </w:r>
           </w:p>
         </w:tc>
@@ -2907,7 +3336,7 @@
         </w:tc>
       </w:tr>
     </w:tbl>
-    <w:bookmarkStart w:id="32" w:name="biến-thể-tách-từ"/>
+    <w:bookmarkStart w:id="33" w:name="biến-thể-tách-từ"/>
     <w:p>
       <w:pPr>
         <w:pStyle w:val="Heading3"/>
@@ -2920,7 +3349,7 @@
       <w:pPr>
         <w:numPr>
           <w:ilvl w:val="0"/>
-          <w:numId w:val="1007"/>
+          <w:numId w:val="1008"/>
         </w:numPr>
       </w:pPr>
       <w:r>
@@ -2937,7 +3366,7 @@
       <w:pPr>
         <w:numPr>
           <w:ilvl w:val="0"/>
-          <w:numId w:val="1007"/>
+          <w:numId w:val="1008"/>
         </w:numPr>
       </w:pPr>
       <w:r>
@@ -2960,7 +3389,7 @@
       <w:pPr>
         <w:numPr>
           <w:ilvl w:val="0"/>
-          <w:numId w:val="1007"/>
+          <w:numId w:val="1008"/>
         </w:numPr>
       </w:pPr>
       <w:r>
@@ -3006,8 +3435,8 @@
         <w:t xml:space="preserve">có thể đổi nghĩa câu hỏi.</w:t>
       </w:r>
     </w:p>
-    <w:bookmarkEnd w:id="32"/>
-    <w:bookmarkStart w:id="33" w:name="kiểm-tra-tự-động"/>
+    <w:bookmarkEnd w:id="33"/>
+    <w:bookmarkStart w:id="34" w:name="kiểm-tra-tự-động"/>
     <w:p>
       <w:pPr>
         <w:pStyle w:val="Heading3"/>
@@ -3195,9 +3624,9 @@
         </w:tc>
       </w:tr>
     </w:tbl>
-    <w:bookmarkEnd w:id="33"/>
     <w:bookmarkEnd w:id="34"/>
-    <w:bookmarkStart w:id="39" w:name="d04-xây-bộ-câu-hỏi-và-gán-nhãn"/>
+    <w:bookmarkEnd w:id="35"/>
+    <w:bookmarkStart w:id="40" w:name="d04-xây-bộ-câu-hỏi-và-gán-nhãn"/>
     <w:p>
       <w:pPr>
         <w:pStyle w:val="Heading2"/>
@@ -3242,7 +3671,7 @@
         <w:t xml:space="preserve">sơ sài.</w:t>
       </w:r>
     </w:p>
-    <w:bookmarkStart w:id="35" w:name="quy-trình-viết-câu-hỏi"/>
+    <w:bookmarkStart w:id="36" w:name="quy-trình-viết-câu-hỏi"/>
     <w:p>
       <w:pPr>
         <w:pStyle w:val="Heading3"/>
@@ -3255,7 +3684,7 @@
       <w:pPr>
         <w:numPr>
           <w:ilvl w:val="0"/>
-          <w:numId w:val="1008"/>
+          <w:numId w:val="1009"/>
         </w:numPr>
       </w:pPr>
       <w:r>
@@ -3284,7 +3713,7 @@
       <w:pPr>
         <w:numPr>
           <w:ilvl w:val="0"/>
-          <w:numId w:val="1008"/>
+          <w:numId w:val="1009"/>
         </w:numPr>
       </w:pPr>
       <w:r>
@@ -3346,7 +3775,7 @@
       <w:pPr>
         <w:numPr>
           <w:ilvl w:val="0"/>
-          <w:numId w:val="1008"/>
+          <w:numId w:val="1009"/>
         </w:numPr>
       </w:pPr>
       <w:r>
@@ -3357,7 +3786,7 @@
       <w:pPr>
         <w:numPr>
           <w:ilvl w:val="0"/>
-          <w:numId w:val="1008"/>
+          <w:numId w:val="1009"/>
         </w:numPr>
       </w:pPr>
       <w:r>
@@ -3380,7 +3809,7 @@
       <w:pPr>
         <w:numPr>
           <w:ilvl w:val="0"/>
-          <w:numId w:val="1008"/>
+          <w:numId w:val="1009"/>
         </w:numPr>
       </w:pPr>
       <w:r>
@@ -3399,8 +3828,8 @@
         <w:t xml:space="preserve">tiên câu do người viết.</w:t>
       </w:r>
     </w:p>
-    <w:bookmarkEnd w:id="35"/>
-    <w:bookmarkStart w:id="36" w:name="Xdd9bdd65683c505b175349bcec9fb35696d344d"/>
+    <w:bookmarkEnd w:id="36"/>
+    <w:bookmarkStart w:id="37" w:name="Xdd9bdd65683c505b175349bcec9fb35696d344d"/>
     <w:p>
       <w:pPr>
         <w:pStyle w:val="Heading3"/>
@@ -3842,8 +4271,8 @@
         </w:tc>
       </w:tr>
     </w:tbl>
-    <w:bookmarkEnd w:id="36"/>
-    <w:bookmarkStart w:id="37" w:name="định-dạng-file"/>
+    <w:bookmarkEnd w:id="37"/>
+    <w:bookmarkStart w:id="38" w:name="định-dạng-file"/>
     <w:p>
       <w:pPr>
         <w:pStyle w:val="Heading3"/>
@@ -4225,8 +4654,8 @@
         <w:t xml:space="preserve">thống được tính đúng khi từ chối trả lời.</w:t>
       </w:r>
     </w:p>
-    <w:bookmarkEnd w:id="37"/>
-    <w:bookmarkStart w:id="38" w:name="hướng-dẫn-gán-nhãn"/>
+    <w:bookmarkEnd w:id="38"/>
+    <w:bookmarkStart w:id="39" w:name="hướng-dẫn-gán-nhãn"/>
     <w:p>
       <w:pPr>
         <w:pStyle w:val="Heading3"/>
@@ -4239,7 +4668,7 @@
       <w:pPr>
         <w:numPr>
           <w:ilvl w:val="0"/>
-          <w:numId w:val="1009"/>
+          <w:numId w:val="1010"/>
         </w:numPr>
       </w:pPr>
       <w:r>
@@ -4256,7 +4685,7 @@
       <w:pPr>
         <w:numPr>
           <w:ilvl w:val="0"/>
-          <w:numId w:val="1009"/>
+          <w:numId w:val="1010"/>
         </w:numPr>
       </w:pPr>
       <w:r>
@@ -4273,7 +4702,7 @@
       <w:pPr>
         <w:numPr>
           <w:ilvl w:val="0"/>
-          <w:numId w:val="1009"/>
+          <w:numId w:val="1010"/>
         </w:numPr>
       </w:pPr>
       <w:r>
@@ -4286,9 +4715,9 @@
         <w:t xml:space="preserve">thiên vị baseline.</w:t>
       </w:r>
     </w:p>
-    <w:bookmarkEnd w:id="38"/>
     <w:bookmarkEnd w:id="39"/>
-    <w:bookmarkStart w:id="40" w:name="d05-kiểm-tra-chất-lượng-nhãn"/>
+    <w:bookmarkEnd w:id="40"/>
+    <w:bookmarkStart w:id="41" w:name="d05-kiểm-tra-chất-lượng-nhãn"/>
     <w:p>
       <w:pPr>
         <w:pStyle w:val="Heading2"/>
@@ -4301,7 +4730,7 @@
       <w:pPr>
         <w:numPr>
           <w:ilvl w:val="0"/>
-          <w:numId w:val="1010"/>
+          <w:numId w:val="1011"/>
         </w:numPr>
       </w:pPr>
       <w:r>
@@ -4318,7 +4747,7 @@
       <w:pPr>
         <w:numPr>
           <w:ilvl w:val="0"/>
-          <w:numId w:val="1010"/>
+          <w:numId w:val="1011"/>
         </w:numPr>
       </w:pPr>
       <w:r>
@@ -4341,7 +4770,7 @@
       <w:pPr>
         <w:numPr>
           <w:ilvl w:val="0"/>
-          <w:numId w:val="1010"/>
+          <w:numId w:val="1011"/>
         </w:numPr>
       </w:pPr>
       <w:r>
@@ -4358,7 +4787,7 @@
       <w:pPr>
         <w:numPr>
           <w:ilvl w:val="0"/>
-          <w:numId w:val="1010"/>
+          <w:numId w:val="1011"/>
         </w:numPr>
       </w:pPr>
       <w:r>
@@ -4395,8 +4824,8 @@
         <w:t xml:space="preserve">results/data_quality/question_stats.csv.</w:t>
       </w:r>
     </w:p>
-    <w:bookmarkEnd w:id="40"/>
-    <w:bookmarkStart w:id="44" w:name="d06-chia-tập-và-freeze-dataset-v1"/>
+    <w:bookmarkEnd w:id="41"/>
+    <w:bookmarkStart w:id="45" w:name="d06-chia-tập-và-freeze-dataset-v1"/>
     <w:p>
       <w:pPr>
         <w:pStyle w:val="Heading2"/>
@@ -4405,7 +4834,7 @@
         <w:t xml:space="preserve">9 D06 Chia tập và Freeze Dataset v1</w:t>
       </w:r>
     </w:p>
-    <w:bookmarkStart w:id="41" w:name="chia-theo-nhóm-câu-hỏi"/>
+    <w:bookmarkStart w:id="42" w:name="chia-theo-nhóm-câu-hỏi"/>
     <w:p>
       <w:pPr>
         <w:pStyle w:val="Heading3"/>
@@ -4448,7 +4877,7 @@
       <w:pPr>
         <w:numPr>
           <w:ilvl w:val="0"/>
-          <w:numId w:val="1011"/>
+          <w:numId w:val="1012"/>
         </w:numPr>
       </w:pPr>
       <w:r>
@@ -4477,7 +4906,7 @@
       <w:pPr>
         <w:numPr>
           <w:ilvl w:val="0"/>
-          <w:numId w:val="1011"/>
+          <w:numId w:val="1012"/>
         </w:numPr>
       </w:pPr>
       <w:r>
@@ -4494,7 +4923,7 @@
       <w:pPr>
         <w:numPr>
           <w:ilvl w:val="0"/>
-          <w:numId w:val="1011"/>
+          <w:numId w:val="1012"/>
         </w:numPr>
       </w:pPr>
       <w:r>
@@ -4505,7 +4934,7 @@
       <w:pPr>
         <w:numPr>
           <w:ilvl w:val="0"/>
-          <w:numId w:val="1011"/>
+          <w:numId w:val="1012"/>
         </w:numPr>
       </w:pPr>
       <w:r>
@@ -4532,8 +4961,8 @@
         <w:t xml:space="preserve">chia.</w:t>
       </w:r>
     </w:p>
-    <w:bookmarkEnd w:id="41"/>
-    <w:bookmarkStart w:id="42" w:name="tiêu-chí-được-phép-freeze"/>
+    <w:bookmarkEnd w:id="42"/>
+    <w:bookmarkStart w:id="43" w:name="tiêu-chí-được-phép-freeze"/>
     <w:p>
       <w:pPr>
         <w:pStyle w:val="Heading3"/>
@@ -4546,7 +4975,7 @@
       <w:pPr>
         <w:numPr>
           <w:ilvl w:val="0"/>
-          <w:numId w:val="1012"/>
+          <w:numId w:val="1013"/>
         </w:numPr>
       </w:pPr>
       <w:r>
@@ -4557,7 +4986,7 @@
       <w:pPr>
         <w:numPr>
           <w:ilvl w:val="0"/>
-          <w:numId w:val="1012"/>
+          <w:numId w:val="1013"/>
         </w:numPr>
       </w:pPr>
       <w:r>
@@ -4568,7 +4997,7 @@
       <w:pPr>
         <w:numPr>
           <w:ilvl w:val="0"/>
-          <w:numId w:val="1012"/>
+          <w:numId w:val="1013"/>
         </w:numPr>
       </w:pPr>
       <w:r>
@@ -4579,7 +5008,7 @@
       <w:pPr>
         <w:numPr>
           <w:ilvl w:val="0"/>
-          <w:numId w:val="1012"/>
+          <w:numId w:val="1013"/>
         </w:numPr>
       </w:pPr>
       <w:r>
@@ -4596,7 +5025,7 @@
       <w:pPr>
         <w:numPr>
           <w:ilvl w:val="0"/>
-          <w:numId w:val="1012"/>
+          <w:numId w:val="1013"/>
         </w:numPr>
       </w:pPr>
       <w:r>
@@ -4607,7 +5036,7 @@
       <w:pPr>
         <w:numPr>
           <w:ilvl w:val="0"/>
-          <w:numId w:val="1012"/>
+          <w:numId w:val="1013"/>
         </w:numPr>
       </w:pPr>
       <w:r>
@@ -4618,7 +5047,7 @@
       <w:pPr>
         <w:numPr>
           <w:ilvl w:val="0"/>
-          <w:numId w:val="1012"/>
+          <w:numId w:val="1013"/>
         </w:numPr>
       </w:pPr>
       <w:r>
@@ -4629,15 +5058,15 @@
       <w:pPr>
         <w:numPr>
           <w:ilvl w:val="0"/>
-          <w:numId w:val="1012"/>
+          <w:numId w:val="1013"/>
         </w:numPr>
       </w:pPr>
       <w:r>
         <w:t xml:space="preserve">Nhóm đã duyệt báo cáo chất lượng.</w:t>
       </w:r>
     </w:p>
-    <w:bookmarkEnd w:id="42"/>
-    <w:bookmarkStart w:id="43" w:name="manifest-gợi-ý"/>
+    <w:bookmarkEnd w:id="43"/>
+    <w:bookmarkStart w:id="44" w:name="manifest-gợi-ý"/>
     <w:p>
       <w:pPr>
         <w:pStyle w:val="Heading3"/>
@@ -4750,9 +5179,9 @@
         <w:t xml:space="preserve">review_status: approved</w:t>
       </w:r>
     </w:p>
-    <w:bookmarkEnd w:id="43"/>
     <w:bookmarkEnd w:id="44"/>
-    <w:bookmarkStart w:id="48" w:name="m01-baseline-tf-idf-và-bm25"/>
+    <w:bookmarkEnd w:id="45"/>
+    <w:bookmarkStart w:id="49" w:name="m01-baseline-tf-idf-và-bm25"/>
     <w:p>
       <w:pPr>
         <w:pStyle w:val="Heading2"/>
@@ -4761,7 +5190,7 @@
         <w:t xml:space="preserve">10 M01 Baseline TF IDF và BM25</w:t>
       </w:r>
     </w:p>
-    <w:bookmarkStart w:id="45" w:name="cách-chạy"/>
+    <w:bookmarkStart w:id="46" w:name="cách-chạy"/>
     <w:p>
       <w:pPr>
         <w:pStyle w:val="Heading3"/>
@@ -4774,7 +5203,7 @@
       <w:pPr>
         <w:numPr>
           <w:ilvl w:val="0"/>
-          <w:numId w:val="1013"/>
+          <w:numId w:val="1014"/>
         </w:numPr>
       </w:pPr>
       <w:r>
@@ -4791,7 +5220,7 @@
       <w:pPr>
         <w:numPr>
           <w:ilvl w:val="0"/>
-          <w:numId w:val="1013"/>
+          <w:numId w:val="1014"/>
         </w:numPr>
       </w:pPr>
       <w:r>
@@ -4808,7 +5237,7 @@
       <w:pPr>
         <w:numPr>
           <w:ilvl w:val="0"/>
-          <w:numId w:val="1013"/>
+          <w:numId w:val="1014"/>
         </w:numPr>
       </w:pPr>
       <w:r>
@@ -4819,7 +5248,7 @@
       <w:pPr>
         <w:numPr>
           <w:ilvl w:val="0"/>
-          <w:numId w:val="1013"/>
+          <w:numId w:val="1014"/>
         </w:numPr>
       </w:pPr>
       <w:r>
@@ -4832,8 +5261,8 @@
         <w:t xml:space="preserve">validation, chốt rồi mới chạy test một lần.</w:t>
       </w:r>
     </w:p>
-    <w:bookmarkEnd w:id="45"/>
-    <w:bookmarkStart w:id="46" w:name="công-thức-chỉ-số"/>
+    <w:bookmarkEnd w:id="46"/>
+    <w:bookmarkStart w:id="47" w:name="công-thức-chỉ-số"/>
     <w:p>
       <w:pPr>
         <w:pStyle w:val="Heading3"/>
@@ -4892,7 +5321,7 @@
       <w:pPr>
         <w:numPr>
           <w:ilvl w:val="0"/>
-          <w:numId w:val="1014"/>
+          <w:numId w:val="1015"/>
         </w:numPr>
       </w:pPr>
       <w:r>
@@ -4909,7 +5338,7 @@
       <w:pPr>
         <w:numPr>
           <w:ilvl w:val="0"/>
-          <w:numId w:val="1014"/>
+          <w:numId w:val="1015"/>
         </w:numPr>
       </w:pPr>
       <w:r>
@@ -4928,8 +5357,8 @@
         <w:t xml:space="preserve">câu hợp lệ.</w:t>
       </w:r>
     </w:p>
-    <w:bookmarkEnd w:id="46"/>
-    <w:bookmarkStart w:id="47" w:name="bảng-kết-quả-mẫu-cần-nộp"/>
+    <w:bookmarkEnd w:id="47"/>
+    <w:bookmarkStart w:id="48" w:name="bảng-kết-quả-mẫu-cần-nộp"/>
     <w:p>
       <w:pPr>
         <w:pStyle w:val="Heading3"/>
@@ -5336,9 +5765,9 @@
         </w:tc>
       </w:tr>
     </w:tbl>
-    <w:bookmarkEnd w:id="47"/>
     <w:bookmarkEnd w:id="48"/>
-    <w:bookmarkStart w:id="49" w:name="X804b674fc2f3e0d11e02f0734d866ab642f8261"/>
+    <w:bookmarkEnd w:id="49"/>
+    <w:bookmarkStart w:id="50" w:name="X804b674fc2f3e0d11e02f0734d866ab642f8261"/>
     <w:p>
       <w:pPr>
         <w:pStyle w:val="Heading2"/>
@@ -5351,7 +5780,7 @@
       <w:pPr>
         <w:numPr>
           <w:ilvl w:val="0"/>
-          <w:numId w:val="1015"/>
+          <w:numId w:val="1016"/>
         </w:numPr>
       </w:pPr>
       <w:r>
@@ -5368,7 +5797,7 @@
       <w:pPr>
         <w:numPr>
           <w:ilvl w:val="0"/>
-          <w:numId w:val="1015"/>
+          <w:numId w:val="1016"/>
         </w:numPr>
       </w:pPr>
       <w:r>
@@ -5385,7 +5814,7 @@
       <w:pPr>
         <w:numPr>
           <w:ilvl w:val="0"/>
-          <w:numId w:val="1015"/>
+          <w:numId w:val="1016"/>
         </w:numPr>
       </w:pPr>
       <w:r>
@@ -5408,7 +5837,7 @@
       <w:pPr>
         <w:numPr>
           <w:ilvl w:val="0"/>
-          <w:numId w:val="1015"/>
+          <w:numId w:val="1016"/>
         </w:numPr>
       </w:pPr>
       <w:r>
@@ -5419,7 +5848,7 @@
       <w:pPr>
         <w:numPr>
           <w:ilvl w:val="0"/>
-          <w:numId w:val="1015"/>
+          <w:numId w:val="1016"/>
         </w:numPr>
       </w:pPr>
       <w:r>
@@ -5432,8 +5861,8 @@
         <w:t xml:space="preserve">dẫn file, cách đọc, kết quả baseline để làm mốc so sánh.</w:t>
       </w:r>
     </w:p>
-    <w:bookmarkEnd w:id="49"/>
-    <w:bookmarkStart w:id="51" w:name="quy-trình-commit-và-pull-request"/>
+    <w:bookmarkEnd w:id="50"/>
+    <w:bookmarkStart w:id="52" w:name="quy-trình-commit-và-pull-request"/>
     <w:p>
       <w:pPr>
         <w:pStyle w:val="Heading2"/>
@@ -5522,7 +5951,7 @@
       <w:pPr>
         <w:numPr>
           <w:ilvl w:val="0"/>
-          <w:numId w:val="1016"/>
+          <w:numId w:val="1017"/>
         </w:numPr>
       </w:pPr>
       <w:r>
@@ -5533,7 +5962,7 @@
       <w:pPr>
         <w:numPr>
           <w:ilvl w:val="0"/>
-          <w:numId w:val="1016"/>
+          <w:numId w:val="1017"/>
         </w:numPr>
       </w:pPr>
       <w:r>
@@ -5542,7 +5971,7 @@
       <w:r>
         <w:t xml:space="preserve"> </w:t>
       </w:r>
-      <w:hyperlink r:id="rId50">
+      <w:hyperlink r:id="rId51">
         <w:r>
           <w:rPr>
             <w:rStyle w:val="Hyperlink"/>
@@ -5564,7 +5993,7 @@
       <w:pPr>
         <w:numPr>
           <w:ilvl w:val="0"/>
-          <w:numId w:val="1016"/>
+          <w:numId w:val="1017"/>
         </w:numPr>
       </w:pPr>
       <w:r>
@@ -5577,8 +6006,8 @@
         <w:t xml:space="preserve">lưu trên Drive chung và ghi đường dẫn trong source_list.csv.</w:t>
       </w:r>
     </w:p>
-    <w:bookmarkEnd w:id="51"/>
-    <w:bookmarkStart w:id="52" w:name="checklist-bàn-giao-cho-nhóm"/>
+    <w:bookmarkEnd w:id="52"/>
+    <w:bookmarkStart w:id="53" w:name="checklist-bàn-giao-cho-nhóm"/>
     <w:p>
       <w:pPr>
         <w:pStyle w:val="Heading2"/>
@@ -5591,7 +6020,7 @@
       <w:pPr>
         <w:numPr>
           <w:ilvl w:val="0"/>
-          <w:numId w:val="1017"/>
+          <w:numId w:val="1018"/>
         </w:numPr>
       </w:pPr>
       <w:r>
@@ -5602,18 +6031,29 @@
       <w:pPr>
         <w:numPr>
           <w:ilvl w:val="0"/>
-          <w:numId w:val="1017"/>
-        </w:numPr>
-      </w:pPr>
-      <w:r>
-        <w:t xml:space="preserve">source_list.csv đủ 3 văn bản: số hiệu, URL, ngày tải, tình trạng hiệu lực.</w:t>
-      </w:r>
-    </w:p>
-    <w:p>
-      <w:pPr>
-        <w:numPr>
-          <w:ilvl w:val="0"/>
-          <w:numId w:val="1017"/>
+          <w:numId w:val="1018"/>
+        </w:numPr>
+      </w:pPr>
+      <w:r>
+        <w:t xml:space="preserve">source_list.csv đủ 10 văn bản: số hiệu, URL, ngày hiệu lực, tình trạng hiệu lực, ngày tải.</w:t>
+      </w:r>
+    </w:p>
+    <w:p>
+      <w:pPr>
+        <w:numPr>
+          <w:ilvl w:val="0"/>
+          <w:numId w:val="1018"/>
+        </w:numPr>
+      </w:pPr>
+      <w:r>
+        <w:t xml:space="preserve">amendments.yaml đủ các thay đổi của văn bản sửa đổi; chunks.jsonl là bản hợp nhất.</w:t>
+      </w:r>
+    </w:p>
+    <w:p>
+      <w:pPr>
+        <w:numPr>
+          <w:ilvl w:val="0"/>
+          <w:numId w:val="1018"/>
         </w:numPr>
       </w:pPr>
       <w:r>
@@ -5624,7 +6064,7 @@
       <w:pPr>
         <w:numPr>
           <w:ilvl w:val="0"/>
-          <w:numId w:val="1017"/>
+          <w:numId w:val="1018"/>
         </w:numPr>
       </w:pPr>
       <w:r>
@@ -5635,7 +6075,7 @@
       <w:pPr>
         <w:numPr>
           <w:ilvl w:val="0"/>
-          <w:numId w:val="1017"/>
+          <w:numId w:val="1018"/>
         </w:numPr>
       </w:pPr>
       <w:r>
@@ -5652,7 +6092,7 @@
       <w:pPr>
         <w:numPr>
           <w:ilvl w:val="0"/>
-          <w:numId w:val="1017"/>
+          <w:numId w:val="1018"/>
         </w:numPr>
       </w:pPr>
       <w:r>
@@ -5663,7 +6103,7 @@
       <w:pPr>
         <w:numPr>
           <w:ilvl w:val="0"/>
-          <w:numId w:val="1017"/>
+          <w:numId w:val="1018"/>
         </w:numPr>
       </w:pPr>
       <w:r>
@@ -5674,7 +6114,7 @@
       <w:pPr>
         <w:numPr>
           <w:ilvl w:val="0"/>
-          <w:numId w:val="1017"/>
+          <w:numId w:val="1018"/>
         </w:numPr>
       </w:pPr>
       <w:r>
@@ -5685,7 +6125,7 @@
       <w:pPr>
         <w:numPr>
           <w:ilvl w:val="0"/>
-          <w:numId w:val="1017"/>
+          <w:numId w:val="1018"/>
         </w:numPr>
       </w:pPr>
       <w:r>
@@ -5696,7 +6136,7 @@
       <w:pPr>
         <w:numPr>
           <w:ilvl w:val="0"/>
-          <w:numId w:val="1017"/>
+          <w:numId w:val="1018"/>
         </w:numPr>
       </w:pPr>
       <w:r>
@@ -5707,15 +6147,15 @@
       <w:pPr>
         <w:numPr>
           <w:ilvl w:val="0"/>
-          <w:numId w:val="1017"/>
+          <w:numId w:val="1018"/>
         </w:numPr>
       </w:pPr>
       <w:r>
         <w:t xml:space="preserve">README ghi lệnh chạy lại từ raw đến kết quả baseline.</w:t>
       </w:r>
     </w:p>
-    <w:bookmarkEnd w:id="52"/>
-    <w:bookmarkStart w:id="53" w:name="các-lỗi-thường-gặp-và-cách-tránh"/>
+    <w:bookmarkEnd w:id="53"/>
+    <w:bookmarkStart w:id="54" w:name="các-lỗi-thường-gặp-và-cách-tránh"/>
     <w:p>
       <w:pPr>
         <w:pStyle w:val="Heading2"/>
@@ -6132,8 +6572,8 @@
         </w:tc>
       </w:tr>
     </w:tbl>
-    <w:bookmarkEnd w:id="53"/>
-    <w:bookmarkStart w:id="54" w:name="lệnh-kiểm-tra-nhanh-cuối-mỗi-giai-đoạn"/>
+    <w:bookmarkEnd w:id="54"/>
+    <w:bookmarkStart w:id="55" w:name="lệnh-kiểm-tra-nhanh-cuối-mỗi-giai-đoạn"/>
     <w:p>
       <w:pPr>
         <w:pStyle w:val="Heading2"/>
@@ -6214,8 +6654,8 @@
         <w:t xml:space="preserve">phải ghi đúng lệnh chạy được sau khi mã được tạo.</w:t>
       </w:r>
     </w:p>
-    <w:bookmarkEnd w:id="54"/>
     <w:bookmarkEnd w:id="55"/>
+    <w:bookmarkEnd w:id="56"/>
     <w:sectPr/>
   </w:body>
 </w:document>
@@ -6559,9 +6999,6 @@
     </w:lvlOverride>
   </w:num>
   <w:num w:numId="1007">
-    <w:abstractNumId w:val="991"/>
-  </w:num>
-  <w:num w:numId="1008">
     <w:abstractNumId w:val="99411"/>
     <w:lvlOverride w:ilvl="0">
       <w:startOverride w:val="1"/>
@@ -6591,10 +7028,10 @@
       <w:startOverride w:val="1"/>
     </w:lvlOverride>
   </w:num>
-  <w:num w:numId="1009">
+  <w:num w:numId="1008">
     <w:abstractNumId w:val="991"/>
   </w:num>
-  <w:num w:numId="1010">
+  <w:num w:numId="1009">
     <w:abstractNumId w:val="99411"/>
     <w:lvlOverride w:ilvl="0">
       <w:startOverride w:val="1"/>
@@ -6623,6 +7060,9 @@
     <w:lvlOverride w:ilvl="8">
       <w:startOverride w:val="1"/>
     </w:lvlOverride>
+  </w:num>
+  <w:num w:numId="1010">
+    <w:abstractNumId w:val="991"/>
   </w:num>
   <w:num w:numId="1011">
     <w:abstractNumId w:val="99411"/>
@@ -6655,15 +7095,6 @@
     </w:lvlOverride>
   </w:num>
   <w:num w:numId="1012">
-    <w:abstractNumId w:val="991"/>
-  </w:num>
-  <w:num w:numId="1013">
-    <w:abstractNumId w:val="991"/>
-  </w:num>
-  <w:num w:numId="1014">
-    <w:abstractNumId w:val="991"/>
-  </w:num>
-  <w:num w:numId="1015">
     <w:abstractNumId w:val="99411"/>
     <w:lvlOverride w:ilvl="0">
       <w:startOverride w:val="1"/>
@@ -6693,10 +7124,49 @@
       <w:startOverride w:val="1"/>
     </w:lvlOverride>
   </w:num>
-  <w:num w:numId="1016">
+  <w:num w:numId="1013">
     <w:abstractNumId w:val="991"/>
   </w:num>
+  <w:num w:numId="1014">
+    <w:abstractNumId w:val="991"/>
+  </w:num>
+  <w:num w:numId="1015">
+    <w:abstractNumId w:val="991"/>
+  </w:num>
+  <w:num w:numId="1016">
+    <w:abstractNumId w:val="99411"/>
+    <w:lvlOverride w:ilvl="0">
+      <w:startOverride w:val="1"/>
+    </w:lvlOverride>
+    <w:lvlOverride w:ilvl="1">
+      <w:startOverride w:val="1"/>
+    </w:lvlOverride>
+    <w:lvlOverride w:ilvl="2">
+      <w:startOverride w:val="1"/>
+    </w:lvlOverride>
+    <w:lvlOverride w:ilvl="3">
+      <w:startOverride w:val="1"/>
+    </w:lvlOverride>
+    <w:lvlOverride w:ilvl="4">
+      <w:startOverride w:val="1"/>
+    </w:lvlOverride>
+    <w:lvlOverride w:ilvl="5">
+      <w:startOverride w:val="1"/>
+    </w:lvlOverride>
+    <w:lvlOverride w:ilvl="6">
+      <w:startOverride w:val="1"/>
+    </w:lvlOverride>
+    <w:lvlOverride w:ilvl="7">
+      <w:startOverride w:val="1"/>
+    </w:lvlOverride>
+    <w:lvlOverride w:ilvl="8">
+      <w:startOverride w:val="1"/>
+    </w:lvlOverride>
+  </w:num>
   <w:num w:numId="1017">
+    <w:abstractNumId w:val="991"/>
+  </w:num>
+  <w:num w:numId="1018">
     <w:abstractNumId w:val="991"/>
   </w:num>
 </w:numbering>

</xml_diff>

<commit_message>
docs: khop huong dan TV1, lo trinh, README voi kho 10 van ban
- huong dan TV1 5.4: bo cum tu so ho khau la remove_phrase, khong phai note; NĐ 120 Phu luc I chunk rieng; ap amendments theo thu tu ngay hieu luc
- data/README: them quy tac thu tu ap sua doi
- lo trinh: bo cau "them nghi dinh, thong tu huong dan" da cu
- README: TV1 tach den Diem va hop nhat van ban sua doi

Co-Authored-By: Claude Opus 5.5 (1M context) <noreply@anthropic.com>
Claude-Session: https://claude.ai/code/session_01J8hW9wVsJvuYjrhXX3hGsR
</commit_message>
<xml_diff>
--- a/docs/files/Huong_dan_Thanh_vien_1_De_tai_10_Dataset_v1.docx
+++ b/docs/files/Huong_dan_Thanh_vien_1_De_tai_10_Dataset_v1.docx
@@ -1221,7 +1221,7 @@
               <w:jc w:val="left"/>
             </w:pPr>
             <w:r>
-              <w:t xml:space="preserve">Không chunk riêng; áp vào văn bản gốc qua data/raw/amendments.yaml (mục 5.4)</w:t>
+              <w:t xml:space="preserve">Không chunk riêng; áp vào văn bản gốc qua data/raw/amendments.yaml (mục 5.4). Riêng NĐ 120/2025 (không sửa câu chữ) thì chunk Điều 4–8 và mục I Phụ lục</w:t>
             </w:r>
           </w:p>
         </w:tc>
@@ -2893,19 +2893,55 @@
         <w:t xml:space="preserve"> </w:t>
       </w:r>
       <w:r>
-        <w:t xml:space="preserve">replace_phrase, note. Thay đổi không sửa câu chữ (bỏ sổ hộ khẩu,</w:t>
-      </w:r>
-      <w:r>
-        <w:t xml:space="preserve"> </w:t>
-      </w:r>
-      <w:r>
-        <w:t xml:space="preserve">thẩm quyền theo chính quyền 2 cấp) ghi bằng note, gắn ghi chú vào</w:t>
-      </w:r>
-      <w:r>
-        <w:t xml:space="preserve"> </w:t>
-      </w:r>
-      <w:r>
-        <w:t xml:space="preserve">Điều liên quan.</w:t>
+        <w:t xml:space="preserve">replace_phrase, note. Bỏ cụm từ</w:t>
+      </w:r>
+      <w:r>
+        <w:t xml:space="preserve"> </w:t>
+      </w:r>
+      <w:r>
+        <w:t xml:space="preserve">“</w:t>
+      </w:r>
+      <w:r>
+        <w:t xml:space="preserve">sổ hộ khẩu, sổ tạm trú</w:t>
+      </w:r>
+      <w:r>
+        <w:t xml:space="preserve">”</w:t>
+      </w:r>
+      <w:r>
+        <w:t xml:space="preserve"> </w:t>
+      </w:r>
+      <w:r>
+        <w:t xml:space="preserve">(104/2022,</w:t>
+      </w:r>
+      <w:r>
+        <w:t xml:space="preserve"> </w:t>
+      </w:r>
+      <w:r>
+        <w:t xml:space="preserve">09/2022) là remove_phrase; câu chữ trong văn bản gốc có thể khác chữ</w:t>
+      </w:r>
+      <w:r>
+        <w:t xml:space="preserve"> </w:t>
+      </w:r>
+      <w:r>
+        <w:t xml:space="preserve">hoa, dấu câu nên phải kiểm tra tay. Thẩm quyền theo chính quyền 2</w:t>
+      </w:r>
+      <w:r>
+        <w:t xml:space="preserve"> </w:t>
+      </w:r>
+      <w:r>
+        <w:t xml:space="preserve">cấp (NĐ 120/2025) không sửa câu chữ, ghi bằng note gắn vào Điều liên</w:t>
+      </w:r>
+      <w:r>
+        <w:t xml:space="preserve"> </w:t>
+      </w:r>
+      <w:r>
+        <w:t xml:space="preserve">quan; thời hạn mới trong mục I Phụ lục NĐ 120 thì chunk riêng, không</w:t>
+      </w:r>
+      <w:r>
+        <w:t xml:space="preserve"> </w:t>
+      </w:r>
+      <w:r>
+        <w:t xml:space="preserve">chỉ ghi note.</w:t>
       </w:r>
     </w:p>
     <w:p>
@@ -2923,6 +2959,35 @@
       </w:r>
       <w:r>
         <w:t xml:space="preserve">không đánh số lại Khoản.</w:t>
+      </w:r>
+    </w:p>
+    <w:p>
+      <w:pPr>
+        <w:numPr>
+          <w:ilvl w:val="0"/>
+          <w:numId w:val="1006"/>
+        </w:numPr>
+      </w:pPr>
+      <w:r>
+        <w:t xml:space="preserve">Áp theo thứ tự ngày hiệu lực của văn bản sửa đổi: 87/2020 →</w:t>
+      </w:r>
+      <w:r>
+        <w:t xml:space="preserve"> </w:t>
+      </w:r>
+      <w:r>
+        <w:t xml:space="preserve">104/2022 → 09/2022 → 04/2024 → 07/2025 → 18/2026. Cùng một Khoản bị</w:t>
+      </w:r>
+      <w:r>
+        <w:t xml:space="preserve"> </w:t>
+      </w:r>
+      <w:r>
+        <w:t xml:space="preserve">sửa nhiều lần (ví dụ khoản 1 Điều 2 NĐ 123 bị 07/2025 rồi 18/2026</w:t>
+      </w:r>
+      <w:r>
+        <w:t xml:space="preserve"> </w:t>
+      </w:r>
+      <w:r>
+        <w:t xml:space="preserve">thay) thì bản sau cùng thắng.</w:t>
       </w:r>
     </w:p>
     <w:p>

</xml_diff>